<commit_message>
Update Mira documentation for POS flow, memberships, and Railway deployment.
Refresh user manual, Word/Excel guides, and add scripts to regenerate docs on Windows.

Co-authored-by: Cursor <cursoragent@cursor.com>
</commit_message>
<xml_diff>
--- a/dليل-استخدام-نظام-ميرا-Mira.docx
+++ b/dليل-استخدام-نظام-ميرا-Mira.docx
@@ -1,11 +1,46 @@
 
-<file path=word/document.xml><?xml version="1.0" encoding="utf-8"?>
+<file path=docProps\app.xml><?xml version="1.0" encoding="utf-8"?>
+<Properties xmlns="http://schemas.openxmlformats.org/officeDocument/2006/extended-properties" xmlns:vt="http://schemas.openxmlformats.org/officeDocument/2006/docPropsVTypes">
+  <Template>Normal.dotm</Template>
+  <TotalTime>0</TotalTime>
+  <Pages>1</Pages>
+  <Words>1607</Words>
+  <Characters>9166</Characters>
+  <Application>Microsoft Office Word</Application>
+  <DocSecurity>0</DocSecurity>
+  <Lines>76</Lines>
+  <Paragraphs>21</Paragraphs>
+  <ScaleCrop>false</ScaleCrop>
+  <Company/>
+  <LinksUpToDate>false</LinksUpToDate>
+  <CharactersWithSpaces>10752</CharactersWithSpaces>
+  <SharedDoc>false</SharedDoc>
+  <HyperlinksChanged>false</HyperlinksChanged>
+  <AppVersion>16.0000</AppVersion>
+</Properties>
+</file>
+
+<file path=docProps\core.xml><?xml version="1.0" encoding="utf-8"?>
+<cp:coreProperties xmlns:cp="http://schemas.openxmlformats.org/package/2006/metadata/core-properties" xmlns:dc="http://purl.org/dc/elements/1.1/" xmlns:dcterms="http://purl.org/dc/terms/" xmlns:dcmitype="http://purl.org/dc/dcmitype/" xmlns:xsi="http://www.w3.org/2001/XMLSchema-instance">
+  <dc:title/>
+  <dc:subject/>
+  <dc:creator>abdullateef moazeen</dc:creator>
+  <cp:keywords/>
+  <dc:description/>
+  <cp:lastModifiedBy>abdullateef moazeen</cp:lastModifiedBy>
+  <cp:revision>1</cp:revision>
+  <dcterms:created xsi:type="dcterms:W3CDTF">2026-08-19T08:18:00Z</dcterms:created>
+  <dcterms:modified xsi:type="dcterms:W3CDTF">2026-08-19T08:18:00Z</dcterms:modified>
+</cp:coreProperties>
+</file>
+
+<file path=word\document.xml><?xml version="1.0" encoding="utf-8"?>
 <w:document xmlns:wpc="http://schemas.microsoft.com/office/word/2010/wordprocessingCanvas" xmlns:cx="http://schemas.microsoft.com/office/drawing/2014/chartex" xmlns:cx1="http://schemas.microsoft.com/office/drawing/2015/9/8/chartex" xmlns:cx2="http://schemas.microsoft.com/office/drawing/2015/10/21/chartex" xmlns:cx3="http://schemas.microsoft.com/office/drawing/2016/5/9/chartex" xmlns:cx4="http://schemas.microsoft.com/office/drawing/2016/5/10/chartex" xmlns:cx5="http://schemas.microsoft.com/office/drawing/2016/5/11/chartex" xmlns:cx6="http://schemas.microsoft.com/office/drawing/2016/5/12/chartex" xmlns:cx7="http://schemas.microsoft.com/office/drawing/2016/5/13/chartex" xmlns:cx8="http://schemas.microsoft.com/office/drawing/2016/5/14/chartex" xmlns:mc="http://schemas.openxmlformats.org/markup-compatibility/2006" xmlns:aink="http://schemas.microsoft.com/office/drawing/2016/ink" xmlns:am3d="http://schemas.microsoft.com/office/drawing/2017/model3d" xmlns:o="urn:schemas-microsoft-com:office:office" xmlns:oel="http://schemas.microsoft.com/office/2019/extlst" xmlns:r="http://schemas.openxmlformats.org/officeDocument/2006/relationships" xmlns:m="http://schemas.openxmlformats.org/officeDocument/2006/math" xmlns:v="urn:schemas-microsoft-com:vml" xmlns:wp14="http://schemas.microsoft.com/office/word/2010/wordprocessingDrawing" xmlns:wp="http://schemas.openxmlformats.org/drawingml/2006/wordprocessingDrawing" xmlns:w10="urn:schemas-microsoft-com:office:word" xmlns:w="http://schemas.openxmlformats.org/wordprocessingml/2006/main" xmlns:w14="http://schemas.microsoft.com/office/word/2010/wordml" xmlns:w15="http://schemas.microsoft.com/office/word/2012/wordml" xmlns:w16cex="http://schemas.microsoft.com/office/word/2018/wordml/cex" xmlns:w16cid="http://schemas.microsoft.com/office/word/2016/wordml/cid" xmlns:w16="http://schemas.microsoft.com/office/word/2018/wordml" xmlns:w16sdtdh="http://schemas.microsoft.com/office/word/2020/wordml/sdtdatahash" xmlns:w16se="http://schemas.microsoft.com/office/word/2015/wordml/symex" xmlns:wpg="http://schemas.microsoft.com/office/word/2010/wordprocessingGroup" xmlns:wpi="http://schemas.microsoft.com/office/word/2010/wordprocessingInk" xmlns:wne="http://schemas.microsoft.com/office/word/2006/wordml" xmlns:wps="http://schemas.microsoft.com/office/word/2010/wordprocessingShape" mc:Ignorable="w14 w15 w16se w16cid w16 w16cex w16sdtdh wp14">
   <w:body>
     <w:p>
       <w:pPr>
-        <w:bidi/>
         <w:spacing w:before="1600" w:after="120" w:line="240" w:lineRule="auto"/>
+        <w:jc w:val="center"/>
         <w:rPr>
           <w:rFonts w:ascii="Segoe UI" w:hAnsi="Segoe UI"/>
           <w:color w:val="212121"/>
@@ -14,8 +49,8 @@
     </w:p>
     <w:p>
       <w:pPr>
-        <w:bidi/>
         <w:spacing w:before="1600" w:after="120" w:line="240" w:lineRule="auto"/>
+        <w:jc w:val="center"/>
         <w:rPr>
           <w:rFonts w:ascii="Segoe UI" w:hAnsi="Segoe UI"/>
           <w:b/>
@@ -45,8 +80,8 @@
     </w:p>
     <w:p>
       <w:pPr>
-        <w:bidi/>
         <w:spacing w:before="1600" w:after="120" w:line="240" w:lineRule="auto"/>
+        <w:jc w:val="center"/>
         <w:rPr>
           <w:rFonts w:ascii="Segoe UI" w:hAnsi="Segoe UI"/>
           <w:color w:val="212121"/>
@@ -66,8 +101,8 @@
     </w:p>
     <w:p>
       <w:pPr>
-        <w:bidi/>
         <w:spacing w:before="480" w:after="120" w:line="240" w:lineRule="auto"/>
+        <w:jc w:val="center"/>
         <w:rPr>
           <w:rFonts w:ascii="Segoe UI" w:hAnsi="Segoe UI"/>
           <w:color w:val="0066CC"/>
@@ -87,8 +122,8 @@
     </w:p>
     <w:p>
       <w:pPr>
-        <w:bidi/>
         <w:spacing w:before="800" w:after="120" w:line="240" w:lineRule="auto"/>
+        <w:jc w:val="center"/>
         <w:rPr>
           <w:rFonts w:ascii="Segoe UI" w:hAnsi="Segoe UI"/>
           <w:color w:val="212121"/>
@@ -103,13 +138,13 @@
           <w:sz w:val="24"/>
           <w:rtl/>
         </w:rPr>
-        <w:t>الإصدار 2026 - أغسطس</w:t>
-      </w:r>
-    </w:p>
-    <w:p>
-      <w:pPr>
-        <w:bidi/>
+        <w:t>الإصدار 2026 - سبتمبر (محدّث)</w:t>
+      </w:r>
+    </w:p>
+    <w:p>
+      <w:pPr>
         <w:spacing w:before="800" w:after="120" w:line="240" w:lineRule="auto"/>
+        <w:jc w:val="center"/>
         <w:rPr>
           <w:rFonts w:ascii="Segoe UI" w:hAnsi="Segoe UI"/>
           <w:color w:val="212121"/>
@@ -119,7 +154,6 @@
     </w:p>
     <w:p>
       <w:pPr>
-        <w:bidi/>
         <w:rPr>
           <w:rFonts w:ascii="Segoe UI" w:hAnsi="Segoe UI"/>
           <w:color w:val="212121"/>
@@ -137,8 +171,8 @@
     </w:p>
     <w:p>
       <w:pPr>
-        <w:bidi/>
         <w:spacing w:before="280" w:after="200" w:line="240" w:lineRule="auto"/>
+        <w:jc w:val="right"/>
         <w:rPr>
           <w:rFonts w:ascii="Segoe UI" w:hAnsi="Segoe UI" w:cs="Segoe UI"/>
           <w:b/>
@@ -154,7 +188,6 @@
           <w:color w:val="C2185B"/>
           <w:sz w:val="36"/>
         </w:rPr>
-        <w:lastRenderedPageBreak/>
         <w:t xml:space="preserve">1) </w:t>
       </w:r>
       <w:r>
@@ -170,8 +203,8 @@
     </w:p>
     <w:p>
       <w:pPr>
-        <w:bidi/>
         <w:spacing w:line="240" w:lineRule="auto"/>
+        <w:jc w:val="right"/>
         <w:rPr>
           <w:rFonts w:ascii="Segoe UI" w:hAnsi="Segoe UI" w:cs="Segoe UI"/>
           <w:color w:val="212121"/>
@@ -230,8 +263,8 @@
           <w:ilvl w:val="0"/>
           <w:numId w:val="1"/>
         </w:numPr>
-        <w:bidi/>
-        <w:spacing w:after="80" w:line="240" w:lineRule="auto"/>
+        <w:spacing w:after="80" w:line="240" w:lineRule="auto"/>
+        <w:jc w:val="right"/>
         <w:rPr>
           <w:rFonts w:ascii="Segoe UI" w:hAnsi="Segoe UI" w:cs="Segoe UI"/>
           <w:color w:val="212121"/>
@@ -255,9 +288,9 @@
     </w:p>
     <w:p>
       <w:pPr>
-        <w:bidi/>
         <w:spacing w:after="80" w:line="240" w:lineRule="auto"/>
         <w:ind w:left="360"/>
+        <w:jc w:val="right"/>
         <w:rPr>
           <w:rFonts w:ascii="Segoe UI" w:hAnsi="Segoe UI" w:cs="Segoe UI"/>
           <w:color w:val="212121"/>
@@ -286,8 +319,8 @@
           <w:ilvl w:val="0"/>
           <w:numId w:val="1"/>
         </w:numPr>
-        <w:bidi/>
-        <w:spacing w:after="80" w:line="240" w:lineRule="auto"/>
+        <w:spacing w:after="80" w:line="240" w:lineRule="auto"/>
+        <w:jc w:val="right"/>
         <w:rPr>
           <w:rFonts w:ascii="Segoe UI" w:hAnsi="Segoe UI" w:cs="Segoe UI"/>
           <w:color w:val="212121"/>
@@ -311,9 +344,9 @@
     </w:p>
     <w:p>
       <w:pPr>
-        <w:bidi/>
         <w:spacing w:after="80" w:line="240" w:lineRule="auto"/>
         <w:ind w:left="360"/>
+        <w:jc w:val="right"/>
         <w:rPr>
           <w:rFonts w:ascii="Segoe UI" w:hAnsi="Segoe UI" w:cs="Segoe UI"/>
           <w:color w:val="212121"/>
@@ -342,8 +375,8 @@
           <w:ilvl w:val="0"/>
           <w:numId w:val="1"/>
         </w:numPr>
-        <w:bidi/>
-        <w:spacing w:after="80" w:line="240" w:lineRule="auto"/>
+        <w:spacing w:after="80" w:line="240" w:lineRule="auto"/>
+        <w:jc w:val="right"/>
         <w:rPr>
           <w:rFonts w:ascii="Segoe UI" w:hAnsi="Segoe UI" w:cs="Segoe UI"/>
           <w:color w:val="212121"/>
@@ -367,9 +400,9 @@
     </w:p>
     <w:p>
       <w:pPr>
-        <w:bidi/>
         <w:spacing w:after="80" w:line="240" w:lineRule="auto"/>
         <w:ind w:left="360"/>
+        <w:jc w:val="right"/>
         <w:rPr>
           <w:rFonts w:ascii="Segoe UI" w:hAnsi="Segoe UI" w:cs="Segoe UI"/>
           <w:color w:val="212121"/>
@@ -398,8 +431,8 @@
           <w:ilvl w:val="0"/>
           <w:numId w:val="1"/>
         </w:numPr>
-        <w:bidi/>
-        <w:spacing w:after="80" w:line="240" w:lineRule="auto"/>
+        <w:spacing w:after="80" w:line="240" w:lineRule="auto"/>
+        <w:jc w:val="right"/>
         <w:rPr>
           <w:rFonts w:ascii="Segoe UI" w:hAnsi="Segoe UI" w:cs="Segoe UI"/>
           <w:color w:val="212121"/>
@@ -423,43 +456,43 @@
     </w:p>
     <w:p>
       <w:pPr>
-        <w:bidi/>
         <w:spacing w:after="80" w:line="240" w:lineRule="auto"/>
         <w:ind w:left="360"/>
-        <w:rPr>
-          <w:rFonts w:ascii="Segoe UI" w:hAnsi="Segoe UI" w:cs="Segoe UI"/>
-          <w:color w:val="212121"/>
-        </w:rPr>
-      </w:pPr>
-      <w:r>
-        <w:rPr>
-          <w:rFonts w:ascii="Segoe UI" w:hAnsi="Segoe UI" w:cs="Segoe UI"/>
-          <w:color w:val="212121"/>
-          <w:rtl/>
-        </w:rPr>
-        <w:t>تقارير المبيعات والأرباح وأداء الموظفين مع تصدير</w:t>
-      </w:r>
-      <w:r>
-        <w:rPr>
-          <w:rFonts w:ascii="Segoe UI" w:hAnsi="Segoe UI" w:cs="Segoe UI"/>
-          <w:color w:val="212121"/>
-        </w:rPr>
-        <w:t xml:space="preserve"> Excel </w:t>
-      </w:r>
-      <w:r>
-        <w:rPr>
-          <w:rFonts w:ascii="Segoe UI" w:hAnsi="Segoe UI" w:cs="Segoe UI"/>
-          <w:color w:val="212121"/>
-          <w:rtl/>
-        </w:rPr>
-        <w:t>و</w:t>
-      </w:r>
-      <w:r>
-        <w:rPr>
-          <w:rFonts w:ascii="Segoe UI" w:hAnsi="Segoe UI" w:cs="Segoe UI"/>
-          <w:color w:val="212121"/>
-        </w:rPr>
-        <w:t>PDF.</w:t>
+        <w:jc w:val="right"/>
+        <w:rPr>
+          <w:rFonts w:ascii="Segoe UI" w:hAnsi="Segoe UI" w:cs="Segoe UI"/>
+          <w:color w:val="212121"/>
+        </w:rPr>
+      </w:pPr>
+      <w:r>
+        <w:rPr>
+          <w:rFonts w:ascii="Segoe UI" w:hAnsi="Segoe UI" w:cs="Segoe UI"/>
+          <w:color w:val="212121"/>
+          <w:rtl/>
+        </w:rPr>
+        <w:t>تقارير المبيعات والأرباح وأداء الموظفين مع تصدير Excel وPDF بلغة الواجهة (عربي/إنجليزي) بتصميم منسّق.</w:t>
+      </w:r>
+      <w:r>
+        <w:rPr>
+          <w:rFonts w:ascii="Segoe UI" w:hAnsi="Segoe UI" w:cs="Segoe UI"/>
+          <w:color w:val="212121"/>
+        </w:rPr>
+        <w:t xml:space="preserve"/>
+      </w:r>
+      <w:r>
+        <w:rPr>
+          <w:rFonts w:ascii="Segoe UI" w:hAnsi="Segoe UI" w:cs="Segoe UI"/>
+          <w:color w:val="212121"/>
+          <w:rtl/>
+        </w:rPr>
+        <w:t/>
+      </w:r>
+      <w:r>
+        <w:rPr>
+          <w:rFonts w:ascii="Segoe UI" w:hAnsi="Segoe UI" w:cs="Segoe UI"/>
+          <w:color w:val="212121"/>
+        </w:rPr>
+        <w:t/>
       </w:r>
     </w:p>
     <w:p>
@@ -469,8 +502,8 @@
           <w:ilvl w:val="0"/>
           <w:numId w:val="1"/>
         </w:numPr>
-        <w:bidi/>
-        <w:spacing w:after="80" w:line="240" w:lineRule="auto"/>
+        <w:spacing w:after="80" w:line="240" w:lineRule="auto"/>
+        <w:jc w:val="right"/>
         <w:rPr>
           <w:rFonts w:ascii="Segoe UI" w:hAnsi="Segoe UI" w:cs="Segoe UI"/>
           <w:color w:val="212121"/>
@@ -524,9 +557,9 @@
     </w:p>
     <w:p>
       <w:pPr>
-        <w:bidi/>
         <w:spacing w:after="80" w:line="240" w:lineRule="auto"/>
         <w:ind w:left="360"/>
+        <w:jc w:val="right"/>
         <w:rPr>
           <w:rFonts w:ascii="Segoe UI" w:hAnsi="Segoe UI" w:cs="Segoe UI"/>
           <w:color w:val="212121"/>
@@ -555,8 +588,8 @@
           <w:ilvl w:val="0"/>
           <w:numId w:val="1"/>
         </w:numPr>
-        <w:bidi/>
-        <w:spacing w:after="80" w:line="240" w:lineRule="auto"/>
+        <w:spacing w:after="80" w:line="240" w:lineRule="auto"/>
+        <w:jc w:val="right"/>
         <w:rPr>
           <w:rFonts w:ascii="Segoe UI" w:hAnsi="Segoe UI" w:cs="Segoe UI"/>
           <w:color w:val="212121"/>
@@ -580,9 +613,9 @@
     </w:p>
     <w:p>
       <w:pPr>
-        <w:bidi/>
         <w:spacing w:after="80" w:line="240" w:lineRule="auto"/>
         <w:ind w:left="360"/>
+        <w:jc w:val="right"/>
         <w:rPr>
           <w:rFonts w:ascii="Segoe UI" w:hAnsi="Segoe UI" w:cs="Segoe UI"/>
           <w:color w:val="212121"/>
@@ -606,9 +639,9 @@
     </w:p>
     <w:p>
       <w:pPr>
-        <w:bidi/>
         <w:spacing w:before="280" w:after="200" w:line="240" w:lineRule="auto"/>
         <w:ind w:left="360"/>
+        <w:jc w:val="right"/>
         <w:rPr>
           <w:rFonts w:ascii="Segoe UI" w:hAnsi="Segoe UI" w:cs="Segoe UI"/>
           <w:b/>
@@ -639,28 +672,28 @@
     </w:p>
     <w:p>
       <w:pPr>
-        <w:bidi/>
         <w:spacing w:line="240" w:lineRule="auto"/>
         <w:ind w:left="360"/>
-        <w:rPr>
-          <w:rFonts w:ascii="Segoe UI" w:hAnsi="Segoe UI" w:cs="Segoe UI"/>
-          <w:color w:val="212121"/>
-        </w:rPr>
-      </w:pPr>
-      <w:r>
-        <w:rPr>
-          <w:rFonts w:ascii="Segoe UI" w:hAnsi="Segoe UI" w:cs="Segoe UI"/>
-          <w:color w:val="212121"/>
-          <w:rtl/>
-        </w:rPr>
-        <w:t>افتح المتصفح ثم اكتب عنوان النظام. إذا كان النظام مثبتًا على نفس جهاز الكاشير فالعنوان هو</w:t>
-      </w:r>
-      <w:r>
-        <w:rPr>
-          <w:rFonts w:ascii="Segoe UI" w:hAnsi="Segoe UI" w:cs="Segoe UI"/>
-          <w:color w:val="212121"/>
-        </w:rPr>
-        <w:t>: http://localhost:5173</w:t>
+        <w:jc w:val="right"/>
+        <w:rPr>
+          <w:rFonts w:ascii="Segoe UI" w:hAnsi="Segoe UI" w:cs="Segoe UI"/>
+          <w:color w:val="212121"/>
+        </w:rPr>
+      </w:pPr>
+      <w:r>
+        <w:rPr>
+          <w:rFonts w:ascii="Segoe UI" w:hAnsi="Segoe UI" w:cs="Segoe UI"/>
+          <w:color w:val="212121"/>
+          <w:rtl/>
+        </w:rPr>
+        <w:t>عنوان الدخول — إنتاج: https://mira-production-296a.up.railway.app/login — محلي:</w:t>
+      </w:r>
+      <w:r>
+        <w:rPr>
+          <w:rFonts w:ascii="Segoe UI" w:hAnsi="Segoe UI" w:cs="Segoe UI"/>
+          <w:color w:val="212121"/>
+        </w:rPr>
+        <w:t> http://localhost:5173/login</w:t>
       </w:r>
       <w:r>
         <w:rPr>
@@ -700,8 +733,8 @@
           <w:ilvl w:val="0"/>
           <w:numId w:val="1"/>
         </w:numPr>
-        <w:bidi/>
-        <w:spacing w:after="80" w:line="240" w:lineRule="auto"/>
+        <w:spacing w:after="80" w:line="240" w:lineRule="auto"/>
+        <w:jc w:val="right"/>
         <w:rPr>
           <w:rFonts w:ascii="Segoe UI" w:hAnsi="Segoe UI" w:cs="Segoe UI"/>
           <w:color w:val="212121"/>
@@ -725,9 +758,9 @@
     </w:p>
     <w:p>
       <w:pPr>
-        <w:bidi/>
         <w:spacing w:after="80" w:line="240" w:lineRule="auto"/>
         <w:ind w:left="360"/>
+        <w:jc w:val="right"/>
         <w:rPr>
           <w:rFonts w:ascii="Segoe UI" w:hAnsi="Segoe UI" w:cs="Segoe UI"/>
           <w:color w:val="212121"/>
@@ -756,8 +789,8 @@
           <w:ilvl w:val="0"/>
           <w:numId w:val="1"/>
         </w:numPr>
-        <w:bidi/>
-        <w:spacing w:after="80" w:line="240" w:lineRule="auto"/>
+        <w:spacing w:after="80" w:line="240" w:lineRule="auto"/>
+        <w:jc w:val="right"/>
         <w:rPr>
           <w:rFonts w:ascii="Segoe UI" w:hAnsi="Segoe UI" w:cs="Segoe UI"/>
           <w:color w:val="212121"/>
@@ -786,9 +819,9 @@
           <w:ilvl w:val="0"/>
           <w:numId w:val="1"/>
         </w:numPr>
-        <w:bidi/>
         <w:spacing w:before="120" w:line="240" w:lineRule="auto"/>
         <w:ind w:left="560"/>
+        <w:jc w:val="right"/>
         <w:rPr>
           <w:rFonts w:ascii="Segoe UI" w:hAnsi="Segoe UI" w:cs="Segoe UI"/>
           <w:color w:val="212121"/>
@@ -826,7 +859,7 @@
           <w:i/>
           <w:color w:val="0066CC"/>
         </w:rPr>
-        <w:t xml:space="preserve"> admin123 — </w:t>
+        <w:t xml:space="preserve"> admin1234 — </w:t>
       </w:r>
       <w:r>
         <w:rPr>
@@ -853,9 +886,9 @@
           <w:ilvl w:val="0"/>
           <w:numId w:val="1"/>
         </w:numPr>
-        <w:bidi/>
         <w:spacing w:before="160" w:after="120" w:line="240" w:lineRule="auto"/>
         <w:ind w:left="0"/>
+        <w:jc w:val="right"/>
         <w:rPr>
           <w:rFonts w:ascii="Segoe UI" w:hAnsi="Segoe UI" w:cs="Segoe UI"/>
           <w:color w:val="212121"/>
@@ -890,6 +923,12 @@
         <w:gridCol w:w="5593"/>
       </w:tblGrid>
       <w:tr>
+        <w:tblPrEx>
+          <w:tblCellMar>
+            <w:top w:w="0" w:type="dxa"/>
+            <w:bottom w:w="0" w:type="dxa"/>
+          </w:tblCellMar>
+        </w:tblPrEx>
         <w:tc>
           <w:tcPr>
             <w:tcW w:w="0" w:type="auto"/>
@@ -902,9 +941,9 @@
                 <w:ilvl w:val="0"/>
                 <w:numId w:val="1"/>
               </w:numPr>
-              <w:bidi/>
               <w:spacing w:before="160" w:after="0" w:line="240" w:lineRule="auto"/>
               <w:ind w:left="0" w:firstLine="0"/>
+              <w:jc w:val="right"/>
               <w:rPr>
                 <w:rFonts w:ascii="Segoe UI" w:hAnsi="Segoe UI" w:cs="Segoe UI"/>
                 <w:b/>
@@ -936,9 +975,9 @@
                 <w:ilvl w:val="0"/>
                 <w:numId w:val="1"/>
               </w:numPr>
-              <w:bidi/>
               <w:spacing w:before="160" w:after="0" w:line="240" w:lineRule="auto"/>
               <w:ind w:left="0" w:firstLine="0"/>
+              <w:jc w:val="right"/>
               <w:rPr>
                 <w:rFonts w:ascii="Segoe UI" w:hAnsi="Segoe UI" w:cs="Segoe UI"/>
                 <w:b/>
@@ -960,6 +999,12 @@
         </w:tc>
       </w:tr>
       <w:tr>
+        <w:tblPrEx>
+          <w:tblCellMar>
+            <w:top w:w="0" w:type="dxa"/>
+            <w:bottom w:w="0" w:type="dxa"/>
+          </w:tblCellMar>
+        </w:tblPrEx>
         <w:tc>
           <w:tcPr>
             <w:tcW w:w="0" w:type="auto"/>
@@ -972,9 +1017,9 @@
                 <w:ilvl w:val="0"/>
                 <w:numId w:val="1"/>
               </w:numPr>
-              <w:bidi/>
               <w:spacing w:before="160" w:after="0" w:line="240" w:lineRule="auto"/>
               <w:ind w:left="0" w:firstLine="0"/>
+              <w:jc w:val="right"/>
               <w:rPr>
                 <w:rFonts w:ascii="Segoe UI" w:hAnsi="Segoe UI" w:cs="Segoe UI"/>
                 <w:color w:val="212121"/>
@@ -1004,9 +1049,9 @@
                 <w:ilvl w:val="0"/>
                 <w:numId w:val="1"/>
               </w:numPr>
-              <w:bidi/>
               <w:spacing w:before="160" w:after="0" w:line="240" w:lineRule="auto"/>
               <w:ind w:left="0" w:firstLine="0"/>
+              <w:jc w:val="right"/>
               <w:rPr>
                 <w:rFonts w:ascii="Segoe UI" w:hAnsi="Segoe UI" w:cs="Segoe UI"/>
                 <w:color w:val="212121"/>
@@ -1026,6 +1071,12 @@
         </w:tc>
       </w:tr>
       <w:tr>
+        <w:tblPrEx>
+          <w:tblCellMar>
+            <w:top w:w="0" w:type="dxa"/>
+            <w:bottom w:w="0" w:type="dxa"/>
+          </w:tblCellMar>
+        </w:tblPrEx>
         <w:tc>
           <w:tcPr>
             <w:tcW w:w="0" w:type="auto"/>
@@ -1038,9 +1089,9 @@
                 <w:ilvl w:val="0"/>
                 <w:numId w:val="1"/>
               </w:numPr>
-              <w:bidi/>
               <w:spacing w:before="160" w:after="0" w:line="240" w:lineRule="auto"/>
               <w:ind w:left="0" w:firstLine="0"/>
+              <w:jc w:val="right"/>
               <w:rPr>
                 <w:rFonts w:ascii="Segoe UI" w:hAnsi="Segoe UI" w:cs="Segoe UI"/>
                 <w:color w:val="212121"/>
@@ -1070,9 +1121,9 @@
                 <w:ilvl w:val="0"/>
                 <w:numId w:val="1"/>
               </w:numPr>
-              <w:bidi/>
               <w:spacing w:before="160" w:after="0" w:line="240" w:lineRule="auto"/>
               <w:ind w:left="0" w:firstLine="0"/>
+              <w:jc w:val="right"/>
               <w:rPr>
                 <w:rFonts w:ascii="Segoe UI" w:hAnsi="Segoe UI" w:cs="Segoe UI"/>
                 <w:color w:val="212121"/>
@@ -1092,6 +1143,12 @@
         </w:tc>
       </w:tr>
       <w:tr>
+        <w:tblPrEx>
+          <w:tblCellMar>
+            <w:top w:w="0" w:type="dxa"/>
+            <w:bottom w:w="0" w:type="dxa"/>
+          </w:tblCellMar>
+        </w:tblPrEx>
         <w:tc>
           <w:tcPr>
             <w:tcW w:w="0" w:type="auto"/>
@@ -1104,9 +1161,9 @@
                 <w:ilvl w:val="0"/>
                 <w:numId w:val="1"/>
               </w:numPr>
-              <w:bidi/>
               <w:spacing w:before="160" w:after="0" w:line="240" w:lineRule="auto"/>
               <w:ind w:left="0" w:firstLine="0"/>
+              <w:jc w:val="right"/>
               <w:rPr>
                 <w:rFonts w:ascii="Segoe UI" w:hAnsi="Segoe UI" w:cs="Segoe UI"/>
                 <w:color w:val="212121"/>
@@ -1136,9 +1193,9 @@
                 <w:ilvl w:val="0"/>
                 <w:numId w:val="1"/>
               </w:numPr>
-              <w:bidi/>
               <w:spacing w:before="160" w:after="0" w:line="240" w:lineRule="auto"/>
               <w:ind w:left="0" w:firstLine="0"/>
+              <w:jc w:val="right"/>
               <w:rPr>
                 <w:rFonts w:ascii="Segoe UI" w:hAnsi="Segoe UI" w:cs="Segoe UI"/>
                 <w:color w:val="212121"/>
@@ -1158,6 +1215,12 @@
         </w:tc>
       </w:tr>
       <w:tr>
+        <w:tblPrEx>
+          <w:tblCellMar>
+            <w:top w:w="0" w:type="dxa"/>
+            <w:bottom w:w="0" w:type="dxa"/>
+          </w:tblCellMar>
+        </w:tblPrEx>
         <w:tc>
           <w:tcPr>
             <w:tcW w:w="0" w:type="auto"/>
@@ -1170,9 +1233,9 @@
                 <w:ilvl w:val="0"/>
                 <w:numId w:val="1"/>
               </w:numPr>
-              <w:bidi/>
               <w:spacing w:before="160" w:after="0" w:line="240" w:lineRule="auto"/>
               <w:ind w:left="0" w:firstLine="0"/>
+              <w:jc w:val="right"/>
               <w:rPr>
                 <w:rFonts w:ascii="Segoe UI" w:hAnsi="Segoe UI" w:cs="Segoe UI"/>
                 <w:color w:val="212121"/>
@@ -1202,9 +1265,9 @@
                 <w:ilvl w:val="0"/>
                 <w:numId w:val="1"/>
               </w:numPr>
-              <w:bidi/>
               <w:spacing w:before="160" w:after="0" w:line="240" w:lineRule="auto"/>
               <w:ind w:left="0" w:firstLine="0"/>
+              <w:jc w:val="right"/>
               <w:rPr>
                 <w:rFonts w:ascii="Segoe UI" w:hAnsi="Segoe UI" w:cs="Segoe UI"/>
                 <w:color w:val="212121"/>
@@ -1231,9 +1294,9 @@
           <w:ilvl w:val="0"/>
           <w:numId w:val="1"/>
         </w:numPr>
-        <w:bidi/>
         <w:spacing w:before="160" w:after="120" w:line="240" w:lineRule="auto"/>
         <w:ind w:left="0"/>
+        <w:jc w:val="right"/>
         <w:rPr>
           <w:rFonts w:ascii="Segoe UI" w:hAnsi="Segoe UI" w:cs="Segoe UI"/>
           <w:color w:val="212121"/>
@@ -1247,21 +1310,20 @@
           <w:ilvl w:val="0"/>
           <w:numId w:val="1"/>
         </w:numPr>
-        <w:bidi/>
         <w:spacing w:line="240" w:lineRule="auto"/>
         <w:ind w:left="0"/>
-        <w:rPr>
-          <w:rFonts w:ascii="Segoe UI" w:hAnsi="Segoe UI" w:cs="Segoe UI"/>
-          <w:color w:val="212121"/>
-        </w:rPr>
-      </w:pPr>
-      <w:r>
-        <w:rPr>
-          <w:rFonts w:ascii="Segoe UI" w:hAnsi="Segoe UI" w:cs="Segoe UI"/>
-          <w:color w:val="212121"/>
-          <w:rtl/>
-        </w:rPr>
-        <w:lastRenderedPageBreak/>
+        <w:jc w:val="right"/>
+        <w:rPr>
+          <w:rFonts w:ascii="Segoe UI" w:hAnsi="Segoe UI" w:cs="Segoe UI"/>
+          <w:color w:val="212121"/>
+        </w:rPr>
+      </w:pPr>
+      <w:r>
+        <w:rPr>
+          <w:rFonts w:ascii="Segoe UI" w:hAnsi="Segoe UI" w:cs="Segoe UI"/>
+          <w:color w:val="212121"/>
+          <w:rtl/>
+        </w:rPr>
         <w:t>يحدد المدير صلاحيات كل مستخدم من صفحة «المستخدمون» داخل الإعدادات، ويمكن إضافة مستخدم لكل موظفة</w:t>
       </w:r>
       <w:r>
@@ -1279,9 +1341,9 @@
           <w:ilvl w:val="0"/>
           <w:numId w:val="1"/>
         </w:numPr>
-        <w:bidi/>
         <w:spacing w:before="280" w:after="200" w:line="240" w:lineRule="auto"/>
         <w:ind w:left="0"/>
+        <w:jc w:val="right"/>
         <w:rPr>
           <w:rFonts w:ascii="Segoe UI" w:hAnsi="Segoe UI" w:cs="Segoe UI"/>
           <w:color w:val="212121"/>
@@ -1323,9 +1385,9 @@
           <w:ilvl w:val="0"/>
           <w:numId w:val="1"/>
         </w:numPr>
-        <w:bidi/>
         <w:spacing w:line="240" w:lineRule="auto"/>
         <w:ind w:left="0"/>
+        <w:jc w:val="right"/>
         <w:rPr>
           <w:rFonts w:ascii="Segoe UI" w:hAnsi="Segoe UI" w:cs="Segoe UI"/>
           <w:color w:val="212121"/>
@@ -1349,9 +1411,9 @@
     </w:p>
     <w:p>
       <w:pPr>
-        <w:bidi/>
         <w:spacing w:after="80" w:line="240" w:lineRule="auto"/>
         <w:ind w:left="-360"/>
+        <w:jc w:val="right"/>
         <w:rPr>
           <w:rFonts w:ascii="Segoe UI" w:hAnsi="Segoe UI" w:cs="Segoe UI"/>
           <w:color w:val="212121"/>
@@ -1380,9 +1442,9 @@
           <w:ilvl w:val="0"/>
           <w:numId w:val="2"/>
         </w:numPr>
-        <w:bidi/>
         <w:spacing w:after="80" w:line="240" w:lineRule="auto"/>
         <w:ind w:left="0"/>
+        <w:jc w:val="right"/>
         <w:rPr>
           <w:rFonts w:ascii="Segoe UI" w:hAnsi="Segoe UI" w:cs="Segoe UI"/>
           <w:color w:val="212121"/>
@@ -1406,50 +1468,50 @@
     </w:p>
     <w:p>
       <w:pPr>
-        <w:bidi/>
         <w:spacing w:after="80" w:line="240" w:lineRule="auto"/>
         <w:ind w:left="-360"/>
-        <w:rPr>
-          <w:rFonts w:ascii="Segoe UI" w:hAnsi="Segoe UI" w:cs="Segoe UI"/>
-          <w:color w:val="212121"/>
-        </w:rPr>
-      </w:pPr>
-      <w:r>
-        <w:rPr>
-          <w:rFonts w:ascii="Segoe UI" w:hAnsi="Segoe UI" w:cs="Segoe UI"/>
-          <w:color w:val="212121"/>
-          <w:rtl/>
-        </w:rPr>
-        <w:t>من الشريط العلوي يمكن اختيار الفرع أو تبديل اللغة</w:t>
-      </w:r>
-      <w:r>
-        <w:rPr>
-          <w:rFonts w:ascii="Segoe UI" w:hAnsi="Segoe UI" w:cs="Segoe UI"/>
-          <w:color w:val="212121"/>
-        </w:rPr>
-        <w:t xml:space="preserve"> (</w:t>
-      </w:r>
-      <w:r>
-        <w:rPr>
-          <w:rFonts w:ascii="Segoe UI" w:hAnsi="Segoe UI" w:cs="Segoe UI"/>
-          <w:color w:val="212121"/>
-          <w:rtl/>
-        </w:rPr>
-        <w:t>عربي</w:t>
-      </w:r>
-      <w:r>
-        <w:rPr>
-          <w:rFonts w:ascii="Segoe UI" w:hAnsi="Segoe UI" w:cs="Segoe UI"/>
-          <w:color w:val="212121"/>
-        </w:rPr>
-        <w:t xml:space="preserve"> / English).</w:t>
-      </w:r>
-    </w:p>
-    <w:p>
-      <w:pPr>
-        <w:bidi/>
+        <w:jc w:val="right"/>
+        <w:rPr>
+          <w:rFonts w:ascii="Segoe UI" w:hAnsi="Segoe UI" w:cs="Segoe UI"/>
+          <w:color w:val="212121"/>
+        </w:rPr>
+      </w:pPr>
+      <w:r>
+        <w:rPr>
+          <w:rFonts w:ascii="Segoe UI" w:hAnsi="Segoe UI" w:cs="Segoe UI"/>
+          <w:color w:val="212121"/>
+          <w:rtl/>
+        </w:rPr>
+        <w:t>من الشريط العلوي يمكن اختيار الفرع أو تبديل اللغة (عربي / English). يظهر اسم النظام «ميرا Mira» في رأس كل صفحة حسب لغة الواجهة (ميرا بالعربية، Mira بالإنجليزية).</w:t>
+      </w:r>
+      <w:r>
+        <w:rPr>
+          <w:rFonts w:ascii="Segoe UI" w:hAnsi="Segoe UI" w:cs="Segoe UI"/>
+          <w:color w:val="212121"/>
+        </w:rPr>
+        <w:t xml:space="preserve"/>
+      </w:r>
+      <w:r>
+        <w:rPr>
+          <w:rFonts w:ascii="Segoe UI" w:hAnsi="Segoe UI" w:cs="Segoe UI"/>
+          <w:color w:val="212121"/>
+          <w:rtl/>
+        </w:rPr>
+        <w:t/>
+      </w:r>
+      <w:r>
+        <w:rPr>
+          <w:rFonts w:ascii="Segoe UI" w:hAnsi="Segoe UI" w:cs="Segoe UI"/>
+          <w:color w:val="212121"/>
+        </w:rPr>
+        <w:t xml:space="preserve"/>
+      </w:r>
+    </w:p>
+    <w:p>
+      <w:pPr>
         <w:spacing w:before="120" w:line="240" w:lineRule="auto"/>
         <w:ind w:left="560"/>
+        <w:jc w:val="right"/>
         <w:rPr>
           <w:rFonts w:ascii="Segoe UI" w:hAnsi="Segoe UI" w:cs="Segoe UI"/>
           <w:i/>
@@ -1476,8 +1538,8 @@
     </w:p>
     <w:p>
       <w:pPr>
-        <w:bidi/>
         <w:spacing w:before="280" w:after="200" w:line="240" w:lineRule="auto"/>
+        <w:jc w:val="right"/>
         <w:rPr>
           <w:rFonts w:ascii="Segoe UI" w:hAnsi="Segoe UI" w:cs="Segoe UI"/>
           <w:b/>
@@ -1508,8 +1570,8 @@
     </w:p>
     <w:p>
       <w:pPr>
-        <w:bidi/>
         <w:spacing w:line="240" w:lineRule="auto"/>
+        <w:jc w:val="right"/>
         <w:rPr>
           <w:rFonts w:ascii="Segoe UI" w:hAnsi="Segoe UI" w:cs="Segoe UI"/>
           <w:color w:val="212121"/>
@@ -1538,8 +1600,8 @@
           <w:ilvl w:val="0"/>
           <w:numId w:val="2"/>
         </w:numPr>
-        <w:bidi/>
-        <w:spacing w:after="80" w:line="240" w:lineRule="auto"/>
+        <w:spacing w:after="80" w:line="240" w:lineRule="auto"/>
+        <w:jc w:val="right"/>
         <w:rPr>
           <w:rFonts w:ascii="Segoe UI" w:hAnsi="Segoe UI" w:cs="Segoe UI"/>
           <w:color w:val="212121"/>
@@ -1563,9 +1625,9 @@
     </w:p>
     <w:p>
       <w:pPr>
-        <w:bidi/>
         <w:spacing w:after="80" w:line="240" w:lineRule="auto"/>
         <w:ind w:left="360"/>
+        <w:jc w:val="right"/>
         <w:rPr>
           <w:rFonts w:ascii="Segoe UI" w:hAnsi="Segoe UI" w:cs="Segoe UI"/>
           <w:color w:val="212121"/>
@@ -1594,8 +1656,8 @@
           <w:ilvl w:val="0"/>
           <w:numId w:val="2"/>
         </w:numPr>
-        <w:bidi/>
-        <w:spacing w:after="80" w:line="240" w:lineRule="auto"/>
+        <w:spacing w:after="80" w:line="240" w:lineRule="auto"/>
+        <w:jc w:val="right"/>
         <w:rPr>
           <w:rFonts w:ascii="Segoe UI" w:hAnsi="Segoe UI" w:cs="Segoe UI"/>
           <w:color w:val="212121"/>
@@ -1619,9 +1681,9 @@
     </w:p>
     <w:p>
       <w:pPr>
-        <w:bidi/>
         <w:spacing w:after="80" w:line="240" w:lineRule="auto"/>
         <w:ind w:left="360"/>
+        <w:jc w:val="right"/>
         <w:rPr>
           <w:rFonts w:ascii="Segoe UI" w:hAnsi="Segoe UI" w:cs="Segoe UI"/>
           <w:color w:val="212121"/>
@@ -1650,8 +1712,8 @@
           <w:ilvl w:val="0"/>
           <w:numId w:val="2"/>
         </w:numPr>
-        <w:bidi/>
-        <w:spacing w:after="80" w:line="240" w:lineRule="auto"/>
+        <w:spacing w:after="80" w:line="240" w:lineRule="auto"/>
+        <w:jc w:val="right"/>
         <w:rPr>
           <w:rFonts w:ascii="Segoe UI" w:hAnsi="Segoe UI" w:cs="Segoe UI"/>
           <w:color w:val="212121"/>
@@ -1680,8 +1742,8 @@
           <w:ilvl w:val="0"/>
           <w:numId w:val="2"/>
         </w:numPr>
-        <w:bidi/>
         <w:spacing w:before="280" w:after="200" w:line="240" w:lineRule="auto"/>
+        <w:jc w:val="right"/>
         <w:rPr>
           <w:rFonts w:ascii="Segoe UI" w:hAnsi="Segoe UI" w:cs="Segoe UI"/>
           <w:color w:val="212121"/>
@@ -1714,8 +1776,8 @@
           <w:ilvl w:val="0"/>
           <w:numId w:val="2"/>
         </w:numPr>
-        <w:bidi/>
         <w:spacing w:line="240" w:lineRule="auto"/>
+        <w:jc w:val="right"/>
         <w:rPr>
           <w:rFonts w:ascii="Segoe UI" w:hAnsi="Segoe UI" w:cs="Segoe UI"/>
           <w:color w:val="212121"/>
@@ -1739,9 +1801,9 @@
     </w:p>
     <w:p>
       <w:pPr>
-        <w:bidi/>
         <w:spacing w:after="80" w:line="240" w:lineRule="auto"/>
         <w:ind w:left="360"/>
+        <w:jc w:val="right"/>
         <w:rPr>
           <w:rFonts w:ascii="Segoe UI" w:hAnsi="Segoe UI" w:cs="Segoe UI"/>
           <w:color w:val="212121"/>
@@ -1770,8 +1832,8 @@
           <w:ilvl w:val="0"/>
           <w:numId w:val="3"/>
         </w:numPr>
-        <w:bidi/>
-        <w:spacing w:after="80" w:line="240" w:lineRule="auto"/>
+        <w:spacing w:after="80" w:line="240" w:lineRule="auto"/>
+        <w:jc w:val="right"/>
         <w:rPr>
           <w:rFonts w:ascii="Segoe UI" w:hAnsi="Segoe UI" w:cs="Segoe UI"/>
           <w:color w:val="212121"/>
@@ -1840,9 +1902,9 @@
     </w:p>
     <w:p>
       <w:pPr>
-        <w:bidi/>
         <w:spacing w:after="80" w:line="240" w:lineRule="auto"/>
         <w:ind w:left="360"/>
+        <w:jc w:val="right"/>
         <w:rPr>
           <w:rFonts w:ascii="Segoe UI" w:hAnsi="Segoe UI" w:cs="Segoe UI"/>
           <w:color w:val="212121"/>
@@ -1871,8 +1933,8 @@
           <w:ilvl w:val="0"/>
           <w:numId w:val="3"/>
         </w:numPr>
-        <w:bidi/>
-        <w:spacing w:after="80" w:line="240" w:lineRule="auto"/>
+        <w:spacing w:after="80" w:line="240" w:lineRule="auto"/>
+        <w:jc w:val="right"/>
         <w:rPr>
           <w:rFonts w:ascii="Segoe UI" w:hAnsi="Segoe UI" w:cs="Segoe UI"/>
           <w:color w:val="212121"/>
@@ -1901,8 +1963,8 @@
           <w:ilvl w:val="0"/>
           <w:numId w:val="3"/>
         </w:numPr>
-        <w:bidi/>
         <w:spacing w:before="280" w:after="200" w:line="240" w:lineRule="auto"/>
+        <w:jc w:val="right"/>
         <w:rPr>
           <w:rFonts w:ascii="Segoe UI" w:hAnsi="Segoe UI" w:cs="Segoe UI"/>
           <w:color w:val="212121"/>
@@ -1944,20 +2006,20 @@
           <w:ilvl w:val="0"/>
           <w:numId w:val="3"/>
         </w:numPr>
-        <w:bidi/>
         <w:spacing w:line="240" w:lineRule="auto"/>
-        <w:rPr>
-          <w:rFonts w:ascii="Segoe UI" w:hAnsi="Segoe UI" w:cs="Segoe UI"/>
-          <w:color w:val="212121"/>
-        </w:rPr>
-      </w:pPr>
-      <w:r>
-        <w:rPr>
-          <w:rFonts w:ascii="Segoe UI" w:hAnsi="Segoe UI" w:cs="Segoe UI"/>
-          <w:color w:val="212121"/>
-          <w:rtl/>
-        </w:rPr>
-        <w:t>صفحة نقطة البيع هي الأكثر استخدامًا يوميًا. خطوات إتمام عملية بيع</w:t>
+        <w:jc w:val="right"/>
+        <w:rPr>
+          <w:rFonts w:ascii="Segoe UI" w:hAnsi="Segoe UI" w:cs="Segoe UI"/>
+          <w:color w:val="212121"/>
+        </w:rPr>
+      </w:pPr>
+      <w:r>
+        <w:rPr>
+          <w:rFonts w:ascii="Segoe UI" w:hAnsi="Segoe UI" w:cs="Segoe UI"/>
+          <w:color w:val="212121"/>
+          <w:rtl/>
+        </w:rPr>
+        <w:t>صفحة نقطة البيع (/admin/pos): ① العميلة ② الدفع ③ الخصومات والولاء (بعد اختيار عميلة)</w:t>
       </w:r>
       <w:r>
         <w:rPr>
@@ -1969,9 +2031,9 @@
     </w:p>
     <w:p>
       <w:pPr>
-        <w:bidi/>
         <w:spacing w:after="80" w:line="240" w:lineRule="auto"/>
         <w:ind w:left="360"/>
+        <w:jc w:val="right"/>
         <w:rPr>
           <w:rFonts w:ascii="Segoe UI" w:hAnsi="Segoe UI" w:cs="Segoe UI"/>
           <w:color w:val="212121"/>
@@ -2000,34 +2062,34 @@
           <w:ilvl w:val="0"/>
           <w:numId w:val="4"/>
         </w:numPr>
-        <w:bidi/>
-        <w:spacing w:after="80" w:line="240" w:lineRule="auto"/>
-        <w:rPr>
-          <w:rFonts w:ascii="Segoe UI" w:hAnsi="Segoe UI" w:cs="Segoe UI"/>
-          <w:color w:val="212121"/>
-        </w:rPr>
-      </w:pPr>
-      <w:r>
-        <w:rPr>
-          <w:rFonts w:ascii="Segoe UI" w:hAnsi="Segoe UI" w:cs="Segoe UI"/>
-          <w:color w:val="212121"/>
-          <w:rtl/>
-        </w:rPr>
-        <w:t>أضف الخدمات من قائمة الخدمات، والمنتجات من تبويب المنتجات، ومشروبات الكافتيريا من تبويب الكافتيريا</w:t>
-      </w:r>
-      <w:r>
-        <w:rPr>
-          <w:rFonts w:ascii="Segoe UI" w:hAnsi="Segoe UI" w:cs="Segoe UI"/>
-          <w:color w:val="212121"/>
-        </w:rPr>
-        <w:t>.</w:t>
-      </w:r>
-    </w:p>
-    <w:p>
-      <w:pPr>
-        <w:bidi/>
+        <w:spacing w:after="80" w:line="240" w:lineRule="auto"/>
+        <w:jc w:val="right"/>
+        <w:rPr>
+          <w:rFonts w:ascii="Segoe UI" w:hAnsi="Segoe UI" w:cs="Segoe UI"/>
+          <w:color w:val="212121"/>
+        </w:rPr>
+      </w:pPr>
+      <w:r>
+        <w:rPr>
+          <w:rFonts w:ascii="Segoe UI" w:hAnsi="Segoe UI" w:cs="Segoe UI"/>
+          <w:color w:val="212121"/>
+          <w:rtl/>
+        </w:rPr>
+        <w:t>أضف الخدمات من قائمة الخدمات، والمنتجات من تبويب المنتجات، ومشروبات الكافتيريا من تبويب الكافتيريا. لإدارة الخدمات والأسعار انتقل إلى صفحة «الخدمات»، ويمكن تعديل اسم الخدمة مباشرة بالنقر المزدوج على اسمها في الجدول.</w:t>
+      </w:r>
+      <w:r>
+        <w:rPr>
+          <w:rFonts w:ascii="Segoe UI" w:hAnsi="Segoe UI" w:cs="Segoe UI"/>
+          <w:color w:val="212121"/>
+        </w:rPr>
+        <w:t/>
+      </w:r>
+    </w:p>
+    <w:p>
+      <w:pPr>
         <w:spacing w:after="80" w:line="240" w:lineRule="auto"/>
         <w:ind w:left="360"/>
+        <w:jc w:val="right"/>
         <w:rPr>
           <w:rFonts w:ascii="Segoe UI" w:hAnsi="Segoe UI" w:cs="Segoe UI"/>
           <w:color w:val="212121"/>
@@ -2056,34 +2118,34 @@
           <w:ilvl w:val="0"/>
           <w:numId w:val="4"/>
         </w:numPr>
-        <w:bidi/>
-        <w:spacing w:after="80" w:line="240" w:lineRule="auto"/>
-        <w:rPr>
-          <w:rFonts w:ascii="Segoe UI" w:hAnsi="Segoe UI" w:cs="Segoe UI"/>
-          <w:color w:val="212121"/>
-        </w:rPr>
-      </w:pPr>
-      <w:r>
-        <w:rPr>
-          <w:rFonts w:ascii="Segoe UI" w:hAnsi="Segoe UI" w:cs="Segoe UI"/>
-          <w:color w:val="212121"/>
-          <w:rtl/>
-        </w:rPr>
-        <w:t>طبّق كود العرض أو الخصم إن وجد، أو استخدم بطاقة هدية لخصم قيمتها، أو أضف إكرامية للموظفة</w:t>
-      </w:r>
-      <w:r>
-        <w:rPr>
-          <w:rFonts w:ascii="Segoe UI" w:hAnsi="Segoe UI" w:cs="Segoe UI"/>
-          <w:color w:val="212121"/>
-        </w:rPr>
-        <w:t>.</w:t>
-      </w:r>
-    </w:p>
-    <w:p>
-      <w:pPr>
-        <w:bidi/>
+        <w:spacing w:after="80" w:line="240" w:lineRule="auto"/>
+        <w:jc w:val="right"/>
+        <w:rPr>
+          <w:rFonts w:ascii="Segoe UI" w:hAnsi="Segoe UI" w:cs="Segoe UI"/>
+          <w:color w:val="212121"/>
+        </w:rPr>
+      </w:pPr>
+      <w:r>
+        <w:rPr>
+          <w:rFonts w:ascii="Segoe UI" w:hAnsi="Segoe UI" w:cs="Segoe UI"/>
+          <w:color w:val="212121"/>
+          <w:rtl/>
+        </w:rPr>
+        <w:t>في «الخصومات والولاء»: خصم، كود عرض، بطاقة هدايا، نقاط ولاء. الإكرامية في قسم الدفع</w:t>
+      </w:r>
+      <w:r>
+        <w:rPr>
+          <w:rFonts w:ascii="Segoe UI" w:hAnsi="Segoe UI" w:cs="Segoe UI"/>
+          <w:color w:val="212121"/>
+        </w:rPr>
+        <w:t>.</w:t>
+      </w:r>
+    </w:p>
+    <w:p>
+      <w:pPr>
         <w:spacing w:after="80" w:line="240" w:lineRule="auto"/>
         <w:ind w:left="360"/>
+        <w:jc w:val="right"/>
         <w:rPr>
           <w:rFonts w:ascii="Segoe UI" w:hAnsi="Segoe UI" w:cs="Segoe UI"/>
           <w:color w:val="212121"/>
@@ -2112,28 +2174,27 @@
           <w:ilvl w:val="0"/>
           <w:numId w:val="4"/>
         </w:numPr>
-        <w:bidi/>
-        <w:spacing w:after="80" w:line="240" w:lineRule="auto"/>
-        <w:rPr>
-          <w:rFonts w:ascii="Segoe UI" w:hAnsi="Segoe UI" w:cs="Segoe UI"/>
-          <w:color w:val="212121"/>
-        </w:rPr>
-      </w:pPr>
-      <w:r>
-        <w:rPr>
-          <w:rFonts w:ascii="Segoe UI" w:hAnsi="Segoe UI" w:cs="Segoe UI"/>
-          <w:color w:val="212121"/>
-          <w:rtl/>
-        </w:rPr>
-        <w:lastRenderedPageBreak/>
-        <w:t>بعد التسجيل يظهر زر «طباعة الإيصال» وتُخصم كمية المنتجات من المخزون تلقائيًا، وتُحتسب عمولة الموظفة</w:t>
-      </w:r>
-      <w:r>
-        <w:rPr>
-          <w:rFonts w:ascii="Segoe UI" w:hAnsi="Segoe UI" w:cs="Segoe UI"/>
-          <w:color w:val="212121"/>
-        </w:rPr>
-        <w:t>.</w:t>
+        <w:spacing w:after="80" w:line="240" w:lineRule="auto"/>
+        <w:jc w:val="right"/>
+        <w:rPr>
+          <w:rFonts w:ascii="Segoe UI" w:hAnsi="Segoe UI" w:cs="Segoe UI"/>
+          <w:color w:val="212121"/>
+        </w:rPr>
+      </w:pPr>
+      <w:r>
+        <w:rPr>
+          <w:rFonts w:ascii="Segoe UI" w:hAnsi="Segoe UI" w:cs="Segoe UI"/>
+          <w:color w:val="212121"/>
+          <w:rtl/>
+        </w:rPr>
+        <w:t>بعد التسجيل يظهر زر «طباعة الإيصال» وتُخصم كمية المنتجات من المخزون تلقائيًا، وتُحتسب عمولة الموظفة. ويظهر اسم الموظفة المختصة على الإيصال وفي نافذة نجاح الفاتورة.</w:t>
+      </w:r>
+      <w:r>
+        <w:rPr>
+          <w:rFonts w:ascii="Segoe UI" w:hAnsi="Segoe UI" w:cs="Segoe UI"/>
+          <w:color w:val="212121"/>
+        </w:rPr>
+        <w:t/>
       </w:r>
     </w:p>
     <w:tbl>
@@ -2154,6 +2215,12 @@
         <w:gridCol w:w="6260"/>
       </w:tblGrid>
       <w:tr>
+        <w:tblPrEx>
+          <w:tblCellMar>
+            <w:top w:w="0" w:type="dxa"/>
+            <w:bottom w:w="0" w:type="dxa"/>
+          </w:tblCellMar>
+        </w:tblPrEx>
         <w:tc>
           <w:tcPr>
             <w:tcW w:w="0" w:type="auto"/>
@@ -2166,9 +2233,9 @@
                 <w:ilvl w:val="0"/>
                 <w:numId w:val="4"/>
               </w:numPr>
-              <w:bidi/>
               <w:spacing w:after="0" w:line="240" w:lineRule="auto"/>
               <w:ind w:left="0" w:firstLine="0"/>
+              <w:jc w:val="right"/>
               <w:rPr>
                 <w:rFonts w:ascii="Segoe UI" w:hAnsi="Segoe UI" w:cs="Segoe UI"/>
                 <w:b/>
@@ -2200,9 +2267,9 @@
                 <w:ilvl w:val="0"/>
                 <w:numId w:val="4"/>
               </w:numPr>
-              <w:bidi/>
               <w:spacing w:after="0" w:line="240" w:lineRule="auto"/>
               <w:ind w:left="0" w:firstLine="0"/>
+              <w:jc w:val="right"/>
               <w:rPr>
                 <w:rFonts w:ascii="Segoe UI" w:hAnsi="Segoe UI" w:cs="Segoe UI"/>
                 <w:b/>
@@ -2224,6 +2291,12 @@
         </w:tc>
       </w:tr>
       <w:tr>
+        <w:tblPrEx>
+          <w:tblCellMar>
+            <w:top w:w="0" w:type="dxa"/>
+            <w:bottom w:w="0" w:type="dxa"/>
+          </w:tblCellMar>
+        </w:tblPrEx>
         <w:tc>
           <w:tcPr>
             <w:tcW w:w="0" w:type="auto"/>
@@ -2236,9 +2309,9 @@
                 <w:ilvl w:val="0"/>
                 <w:numId w:val="4"/>
               </w:numPr>
-              <w:bidi/>
               <w:spacing w:after="0" w:line="240" w:lineRule="auto"/>
               <w:ind w:left="0" w:firstLine="0"/>
+              <w:jc w:val="right"/>
               <w:rPr>
                 <w:rFonts w:ascii="Segoe UI" w:hAnsi="Segoe UI" w:cs="Segoe UI"/>
                 <w:color w:val="212121"/>
@@ -2268,9 +2341,9 @@
                 <w:ilvl w:val="0"/>
                 <w:numId w:val="4"/>
               </w:numPr>
-              <w:bidi/>
               <w:spacing w:after="0" w:line="240" w:lineRule="auto"/>
               <w:ind w:left="0" w:firstLine="0"/>
+              <w:jc w:val="right"/>
               <w:rPr>
                 <w:rFonts w:ascii="Segoe UI" w:hAnsi="Segoe UI" w:cs="Segoe UI"/>
                 <w:color w:val="212121"/>
@@ -2290,6 +2363,12 @@
         </w:tc>
       </w:tr>
       <w:tr>
+        <w:tblPrEx>
+          <w:tblCellMar>
+            <w:top w:w="0" w:type="dxa"/>
+            <w:bottom w:w="0" w:type="dxa"/>
+          </w:tblCellMar>
+        </w:tblPrEx>
         <w:tc>
           <w:tcPr>
             <w:tcW w:w="0" w:type="auto"/>
@@ -2302,9 +2381,9 @@
                 <w:ilvl w:val="0"/>
                 <w:numId w:val="4"/>
               </w:numPr>
-              <w:bidi/>
               <w:spacing w:after="0" w:line="240" w:lineRule="auto"/>
               <w:ind w:left="0" w:firstLine="0"/>
+              <w:jc w:val="right"/>
               <w:rPr>
                 <w:rFonts w:ascii="Segoe UI" w:hAnsi="Segoe UI" w:cs="Segoe UI"/>
                 <w:color w:val="212121"/>
@@ -2334,9 +2413,9 @@
                 <w:ilvl w:val="0"/>
                 <w:numId w:val="4"/>
               </w:numPr>
-              <w:bidi/>
               <w:spacing w:after="0" w:line="240" w:lineRule="auto"/>
               <w:ind w:left="0" w:firstLine="0"/>
+              <w:jc w:val="right"/>
               <w:rPr>
                 <w:rFonts w:ascii="Segoe UI" w:hAnsi="Segoe UI" w:cs="Segoe UI"/>
                 <w:color w:val="212121"/>
@@ -2356,6 +2435,12 @@
         </w:tc>
       </w:tr>
       <w:tr>
+        <w:tblPrEx>
+          <w:tblCellMar>
+            <w:top w:w="0" w:type="dxa"/>
+            <w:bottom w:w="0" w:type="dxa"/>
+          </w:tblCellMar>
+        </w:tblPrEx>
         <w:tc>
           <w:tcPr>
             <w:tcW w:w="0" w:type="auto"/>
@@ -2368,9 +2453,9 @@
                 <w:ilvl w:val="0"/>
                 <w:numId w:val="4"/>
               </w:numPr>
-              <w:bidi/>
               <w:spacing w:after="0" w:line="240" w:lineRule="auto"/>
               <w:ind w:left="0" w:firstLine="0"/>
+              <w:jc w:val="right"/>
               <w:rPr>
                 <w:rFonts w:ascii="Segoe UI" w:hAnsi="Segoe UI" w:cs="Segoe UI"/>
                 <w:color w:val="212121"/>
@@ -2400,9 +2485,9 @@
                 <w:ilvl w:val="0"/>
                 <w:numId w:val="4"/>
               </w:numPr>
-              <w:bidi/>
               <w:spacing w:after="0" w:line="240" w:lineRule="auto"/>
               <w:ind w:left="0" w:firstLine="0"/>
+              <w:jc w:val="right"/>
               <w:rPr>
                 <w:rFonts w:ascii="Segoe UI" w:hAnsi="Segoe UI" w:cs="Segoe UI"/>
                 <w:color w:val="212121"/>
@@ -2447,6 +2532,12 @@
         </w:tc>
       </w:tr>
       <w:tr>
+        <w:tblPrEx>
+          <w:tblCellMar>
+            <w:top w:w="0" w:type="dxa"/>
+            <w:bottom w:w="0" w:type="dxa"/>
+          </w:tblCellMar>
+        </w:tblPrEx>
         <w:tc>
           <w:tcPr>
             <w:tcW w:w="0" w:type="auto"/>
@@ -2459,9 +2550,9 @@
                 <w:ilvl w:val="0"/>
                 <w:numId w:val="4"/>
               </w:numPr>
-              <w:bidi/>
               <w:spacing w:after="0" w:line="240" w:lineRule="auto"/>
               <w:ind w:left="0" w:firstLine="0"/>
+              <w:jc w:val="right"/>
               <w:rPr>
                 <w:rFonts w:ascii="Segoe UI" w:hAnsi="Segoe UI" w:cs="Segoe UI"/>
                 <w:color w:val="212121"/>
@@ -2491,9 +2582,9 @@
                 <w:ilvl w:val="0"/>
                 <w:numId w:val="4"/>
               </w:numPr>
-              <w:bidi/>
               <w:spacing w:after="0" w:line="240" w:lineRule="auto"/>
               <w:ind w:left="0" w:firstLine="0"/>
+              <w:jc w:val="right"/>
               <w:rPr>
                 <w:rFonts w:ascii="Segoe UI" w:hAnsi="Segoe UI" w:cs="Segoe UI"/>
                 <w:color w:val="212121"/>
@@ -2520,8 +2611,8 @@
           <w:ilvl w:val="0"/>
           <w:numId w:val="4"/>
         </w:numPr>
-        <w:bidi/>
-        <w:spacing w:after="80" w:line="240" w:lineRule="auto"/>
+        <w:spacing w:after="80" w:line="240" w:lineRule="auto"/>
+        <w:jc w:val="right"/>
         <w:rPr>
           <w:rFonts w:ascii="Segoe UI" w:hAnsi="Segoe UI" w:cs="Segoe UI"/>
           <w:color w:val="212121"/>
@@ -2535,9 +2626,9 @@
           <w:ilvl w:val="0"/>
           <w:numId w:val="4"/>
         </w:numPr>
-        <w:bidi/>
         <w:spacing w:before="120" w:line="240" w:lineRule="auto"/>
         <w:ind w:left="560"/>
+        <w:jc w:val="right"/>
         <w:rPr>
           <w:rFonts w:ascii="Segoe UI" w:hAnsi="Segoe UI" w:cs="Segoe UI"/>
           <w:color w:val="212121"/>
@@ -2636,9 +2727,9 @@
           <w:ilvl w:val="0"/>
           <w:numId w:val="4"/>
         </w:numPr>
-        <w:bidi/>
         <w:spacing w:before="280" w:after="200" w:line="240" w:lineRule="auto"/>
         <w:ind w:left="0"/>
+        <w:jc w:val="right"/>
         <w:rPr>
           <w:rFonts w:ascii="Segoe UI" w:hAnsi="Segoe UI" w:cs="Segoe UI"/>
           <w:color w:val="212121"/>
@@ -2666,9 +2757,9 @@
     </w:p>
     <w:p>
       <w:pPr>
-        <w:bidi/>
         <w:spacing w:after="80" w:line="240" w:lineRule="auto"/>
         <w:ind w:left="-360"/>
+        <w:jc w:val="right"/>
         <w:rPr>
           <w:rFonts w:ascii="Segoe UI" w:hAnsi="Segoe UI" w:cs="Segoe UI"/>
           <w:color w:val="212121"/>
@@ -2727,9 +2818,9 @@
           <w:ilvl w:val="0"/>
           <w:numId w:val="5"/>
         </w:numPr>
-        <w:bidi/>
         <w:spacing w:after="80" w:line="240" w:lineRule="auto"/>
         <w:ind w:left="0"/>
+        <w:jc w:val="right"/>
         <w:rPr>
           <w:rFonts w:ascii="Segoe UI" w:hAnsi="Segoe UI" w:cs="Segoe UI"/>
           <w:color w:val="212121"/>
@@ -2753,9 +2844,9 @@
     </w:p>
     <w:p>
       <w:pPr>
-        <w:bidi/>
         <w:spacing w:after="80" w:line="240" w:lineRule="auto"/>
         <w:ind w:left="-360"/>
+        <w:jc w:val="right"/>
         <w:rPr>
           <w:rFonts w:ascii="Segoe UI" w:hAnsi="Segoe UI" w:cs="Segoe UI"/>
           <w:color w:val="212121"/>
@@ -2779,9 +2870,9 @@
     </w:p>
     <w:p>
       <w:pPr>
-        <w:bidi/>
         <w:spacing w:before="280" w:after="200" w:line="240" w:lineRule="auto"/>
         <w:ind w:left="-360"/>
+        <w:jc w:val="right"/>
         <w:rPr>
           <w:rFonts w:ascii="Segoe UI" w:hAnsi="Segoe UI" w:cs="Segoe UI"/>
           <w:b/>
@@ -2817,9 +2908,9 @@
           <w:ilvl w:val="0"/>
           <w:numId w:val="5"/>
         </w:numPr>
-        <w:bidi/>
         <w:spacing w:after="80" w:line="240" w:lineRule="auto"/>
         <w:ind w:left="0"/>
+        <w:jc w:val="right"/>
         <w:rPr>
           <w:rFonts w:ascii="Segoe UI" w:hAnsi="Segoe UI" w:cs="Segoe UI"/>
           <w:b/>
@@ -2845,9 +2936,9 @@
     </w:p>
     <w:p>
       <w:pPr>
-        <w:bidi/>
         <w:spacing w:after="80" w:line="240" w:lineRule="auto"/>
         <w:ind w:left="-360"/>
+        <w:jc w:val="right"/>
         <w:rPr>
           <w:rFonts w:ascii="Segoe UI" w:hAnsi="Segoe UI" w:cs="Segoe UI"/>
           <w:color w:val="212121"/>
@@ -2876,9 +2967,9 @@
           <w:ilvl w:val="0"/>
           <w:numId w:val="5"/>
         </w:numPr>
-        <w:bidi/>
         <w:spacing w:after="80" w:line="240" w:lineRule="auto"/>
         <w:ind w:left="0"/>
+        <w:jc w:val="right"/>
         <w:rPr>
           <w:rFonts w:ascii="Segoe UI" w:hAnsi="Segoe UI" w:cs="Segoe UI"/>
           <w:color w:val="212121"/>
@@ -2902,9 +2993,9 @@
     </w:p>
     <w:p>
       <w:pPr>
-        <w:bidi/>
         <w:spacing w:after="80" w:line="240" w:lineRule="auto"/>
         <w:ind w:left="-360"/>
+        <w:jc w:val="right"/>
         <w:rPr>
           <w:rFonts w:ascii="Segoe UI" w:hAnsi="Segoe UI" w:cs="Segoe UI"/>
           <w:color w:val="212121"/>
@@ -2928,9 +3019,9 @@
     </w:p>
     <w:p>
       <w:pPr>
-        <w:bidi/>
         <w:spacing w:before="280" w:after="200" w:line="240" w:lineRule="auto"/>
         <w:ind w:left="-360"/>
+        <w:jc w:val="right"/>
         <w:rPr>
           <w:rFonts w:ascii="Segoe UI" w:hAnsi="Segoe UI" w:cs="Segoe UI"/>
           <w:b/>
@@ -2961,9 +3052,9 @@
     </w:p>
     <w:p>
       <w:pPr>
-        <w:bidi/>
         <w:spacing w:line="240" w:lineRule="auto"/>
         <w:ind w:left="-360"/>
+        <w:jc w:val="right"/>
         <w:rPr>
           <w:rFonts w:ascii="Segoe UI" w:hAnsi="Segoe UI" w:cs="Segoe UI"/>
           <w:color w:val="212121"/>
@@ -2987,9 +3078,9 @@
     </w:p>
     <w:p>
       <w:pPr>
-        <w:bidi/>
         <w:spacing w:before="280" w:after="200" w:line="240" w:lineRule="auto"/>
         <w:ind w:left="-360"/>
+        <w:jc w:val="right"/>
         <w:rPr>
           <w:rFonts w:ascii="Segoe UI" w:hAnsi="Segoe UI" w:cs="Segoe UI"/>
           <w:b/>
@@ -3025,9 +3116,9 @@
           <w:ilvl w:val="0"/>
           <w:numId w:val="5"/>
         </w:numPr>
-        <w:bidi/>
         <w:spacing w:after="80" w:line="240" w:lineRule="auto"/>
         <w:ind w:left="0"/>
+        <w:jc w:val="right"/>
         <w:rPr>
           <w:rFonts w:ascii="Segoe UI" w:hAnsi="Segoe UI" w:cs="Segoe UI"/>
           <w:b/>
@@ -3053,9 +3144,9 @@
     </w:p>
     <w:p>
       <w:pPr>
-        <w:bidi/>
         <w:spacing w:after="80" w:line="240" w:lineRule="auto"/>
         <w:ind w:left="-360"/>
+        <w:jc w:val="right"/>
         <w:rPr>
           <w:rFonts w:ascii="Segoe UI" w:hAnsi="Segoe UI" w:cs="Segoe UI"/>
           <w:color w:val="212121"/>
@@ -3084,9 +3175,9 @@
           <w:ilvl w:val="0"/>
           <w:numId w:val="5"/>
         </w:numPr>
-        <w:bidi/>
         <w:spacing w:after="80" w:line="240" w:lineRule="auto"/>
         <w:ind w:left="0"/>
+        <w:jc w:val="right"/>
         <w:rPr>
           <w:rFonts w:ascii="Segoe UI" w:hAnsi="Segoe UI" w:cs="Segoe UI"/>
           <w:color w:val="212121"/>
@@ -3115,9 +3206,9 @@
           <w:ilvl w:val="0"/>
           <w:numId w:val="5"/>
         </w:numPr>
-        <w:bidi/>
         <w:spacing w:before="280" w:after="200" w:line="240" w:lineRule="auto"/>
         <w:ind w:left="0"/>
+        <w:jc w:val="right"/>
         <w:rPr>
           <w:rFonts w:ascii="Segoe UI" w:hAnsi="Segoe UI" w:cs="Segoe UI"/>
           <w:color w:val="212121"/>
@@ -3145,22 +3236,21 @@
     </w:p>
     <w:p>
       <w:pPr>
-        <w:bidi/>
         <w:spacing w:after="80" w:line="240" w:lineRule="auto"/>
         <w:ind w:left="-360"/>
-        <w:rPr>
-          <w:rFonts w:ascii="Segoe UI" w:hAnsi="Segoe UI" w:cs="Segoe UI"/>
-          <w:color w:val="212121"/>
-        </w:rPr>
-      </w:pPr>
-      <w:r>
-        <w:rPr>
-          <w:rFonts w:ascii="Segoe UI" w:hAnsi="Segoe UI" w:cs="Segoe UI"/>
-          <w:color w:val="212121"/>
-          <w:rtl/>
-        </w:rPr>
-        <w:lastRenderedPageBreak/>
-        <w:t>صفحة «العضويات»: إنشاء خطط العضوية (المدة، السعر، الخدمات المشمولة)</w:t>
+        <w:jc w:val="right"/>
+        <w:rPr>
+          <w:rFonts w:ascii="Segoe UI" w:hAnsi="Segoe UI" w:cs="Segoe UI"/>
+          <w:color w:val="212121"/>
+        </w:rPr>
+      </w:pPr>
+      <w:r>
+        <w:rPr>
+          <w:rFonts w:ascii="Segoe UI" w:hAnsi="Segoe UI" w:cs="Segoe UI"/>
+          <w:color w:val="212121"/>
+          <w:rtl/>
+        </w:rPr>
+        <w:t>صفحة «العضويات» (/admin/memberships): باقات + ربط اختياري بخدمات (فارغ = الكل)</w:t>
       </w:r>
       <w:r>
         <w:rPr>
@@ -3177,35 +3267,35 @@
           <w:ilvl w:val="0"/>
           <w:numId w:val="6"/>
         </w:numPr>
-        <w:bidi/>
         <w:spacing w:after="80" w:line="240" w:lineRule="auto"/>
         <w:ind w:left="0"/>
-        <w:rPr>
-          <w:rFonts w:ascii="Segoe UI" w:hAnsi="Segoe UI" w:cs="Segoe UI"/>
-          <w:color w:val="212121"/>
-        </w:rPr>
-      </w:pPr>
-      <w:r>
-        <w:rPr>
-          <w:rFonts w:ascii="Segoe UI" w:hAnsi="Segoe UI" w:cs="Segoe UI"/>
-          <w:color w:val="212121"/>
-          <w:rtl/>
-        </w:rPr>
-        <w:t>شراء عضوية لعميلة من ملفها أو من صفحة العضويات، وتُحسب مدة التفعيل تلقائيًا</w:t>
-      </w:r>
-      <w:r>
-        <w:rPr>
-          <w:rFonts w:ascii="Segoe UI" w:hAnsi="Segoe UI" w:cs="Segoe UI"/>
-          <w:color w:val="212121"/>
-        </w:rPr>
-        <w:t>.</w:t>
-      </w:r>
-    </w:p>
-    <w:p>
-      <w:pPr>
-        <w:bidi/>
+        <w:jc w:val="right"/>
+        <w:rPr>
+          <w:rFonts w:ascii="Segoe UI" w:hAnsi="Segoe UI" w:cs="Segoe UI"/>
+          <w:color w:val="212121"/>
+        </w:rPr>
+      </w:pPr>
+      <w:r>
+        <w:rPr>
+          <w:rFonts w:ascii="Segoe UI" w:hAnsi="Segoe UI" w:cs="Segoe UI"/>
+          <w:color w:val="212121"/>
+          <w:rtl/>
+        </w:rPr>
+        <w:t>تعيين عضوية: بحث بالاسم/الجوال، معاينة الباقة، منع التعيين إن وُجدت عضوية نشطة</w:t>
+      </w:r>
+      <w:r>
+        <w:rPr>
+          <w:rFonts w:ascii="Segoe UI" w:hAnsi="Segoe UI" w:cs="Segoe UI"/>
+          <w:color w:val="212121"/>
+        </w:rPr>
+        <w:t>.</w:t>
+      </w:r>
+    </w:p>
+    <w:p>
+      <w:pPr>
         <w:spacing w:after="80" w:line="240" w:lineRule="auto"/>
         <w:ind w:left="-360"/>
+        <w:jc w:val="right"/>
         <w:rPr>
           <w:rFonts w:ascii="Segoe UI" w:hAnsi="Segoe UI" w:cs="Segoe UI"/>
           <w:color w:val="212121"/>
@@ -3234,9 +3324,9 @@
           <w:ilvl w:val="0"/>
           <w:numId w:val="6"/>
         </w:numPr>
-        <w:bidi/>
         <w:spacing w:after="80" w:line="240" w:lineRule="auto"/>
         <w:ind w:left="0"/>
+        <w:jc w:val="right"/>
         <w:rPr>
           <w:rFonts w:ascii="Segoe UI" w:hAnsi="Segoe UI" w:cs="Segoe UI"/>
           <w:color w:val="212121"/>
@@ -3265,9 +3355,9 @@
           <w:ilvl w:val="0"/>
           <w:numId w:val="6"/>
         </w:numPr>
-        <w:bidi/>
         <w:spacing w:before="280" w:after="200" w:line="240" w:lineRule="auto"/>
         <w:ind w:left="0"/>
+        <w:jc w:val="right"/>
         <w:rPr>
           <w:rFonts w:ascii="Segoe UI" w:hAnsi="Segoe UI" w:cs="Segoe UI"/>
           <w:color w:val="212121"/>
@@ -3300,9 +3390,9 @@
           <w:ilvl w:val="0"/>
           <w:numId w:val="6"/>
         </w:numPr>
-        <w:bidi/>
         <w:spacing w:line="240" w:lineRule="auto"/>
         <w:ind w:left="0"/>
+        <w:jc w:val="right"/>
         <w:rPr>
           <w:rFonts w:ascii="Segoe UI" w:hAnsi="Segoe UI" w:cs="Segoe UI"/>
           <w:color w:val="212121"/>
@@ -3331,9 +3421,9 @@
           <w:ilvl w:val="0"/>
           <w:numId w:val="6"/>
         </w:numPr>
-        <w:bidi/>
         <w:spacing w:before="280" w:after="200" w:line="240" w:lineRule="auto"/>
         <w:ind w:left="0"/>
+        <w:jc w:val="right"/>
         <w:rPr>
           <w:rFonts w:ascii="Segoe UI" w:hAnsi="Segoe UI" w:cs="Segoe UI"/>
           <w:color w:val="212121"/>
@@ -3366,9 +3456,9 @@
           <w:ilvl w:val="0"/>
           <w:numId w:val="6"/>
         </w:numPr>
-        <w:bidi/>
         <w:spacing w:line="240" w:lineRule="auto"/>
         <w:ind w:left="0"/>
+        <w:jc w:val="right"/>
         <w:rPr>
           <w:rFonts w:ascii="Segoe UI" w:hAnsi="Segoe UI" w:cs="Segoe UI"/>
           <w:color w:val="212121"/>
@@ -3397,9 +3487,9 @@
           <w:ilvl w:val="0"/>
           <w:numId w:val="6"/>
         </w:numPr>
-        <w:bidi/>
         <w:spacing w:before="280" w:after="200" w:line="240" w:lineRule="auto"/>
         <w:ind w:left="0"/>
+        <w:jc w:val="right"/>
         <w:rPr>
           <w:rFonts w:ascii="Segoe UI" w:hAnsi="Segoe UI" w:cs="Segoe UI"/>
           <w:color w:val="212121"/>
@@ -3427,9 +3517,9 @@
     </w:p>
     <w:p>
       <w:pPr>
-        <w:bidi/>
         <w:spacing w:after="80" w:line="240" w:lineRule="auto"/>
         <w:ind w:left="-360"/>
+        <w:jc w:val="right"/>
         <w:rPr>
           <w:rFonts w:ascii="Segoe UI" w:hAnsi="Segoe UI" w:cs="Segoe UI"/>
           <w:color w:val="212121"/>
@@ -3458,9 +3548,9 @@
           <w:ilvl w:val="0"/>
           <w:numId w:val="7"/>
         </w:numPr>
-        <w:bidi/>
         <w:spacing w:after="80" w:line="240" w:lineRule="auto"/>
         <w:ind w:left="0"/>
+        <w:jc w:val="right"/>
         <w:rPr>
           <w:rFonts w:ascii="Segoe UI" w:hAnsi="Segoe UI" w:cs="Segoe UI"/>
           <w:color w:val="212121"/>
@@ -3484,9 +3574,9 @@
     </w:p>
     <w:p>
       <w:pPr>
-        <w:bidi/>
         <w:spacing w:after="80" w:line="240" w:lineRule="auto"/>
         <w:ind w:left="-360"/>
+        <w:jc w:val="right"/>
         <w:rPr>
           <w:rFonts w:ascii="Segoe UI" w:hAnsi="Segoe UI" w:cs="Segoe UI"/>
           <w:color w:val="212121"/>
@@ -3510,9 +3600,9 @@
     </w:p>
     <w:p>
       <w:pPr>
-        <w:bidi/>
         <w:spacing w:before="120" w:line="240" w:lineRule="auto"/>
         <w:ind w:left="560"/>
+        <w:jc w:val="right"/>
         <w:rPr>
           <w:rFonts w:ascii="Segoe UI" w:hAnsi="Segoe UI" w:cs="Segoe UI"/>
           <w:i/>
@@ -3539,8 +3629,8 @@
     </w:p>
     <w:p>
       <w:pPr>
-        <w:bidi/>
         <w:spacing w:before="280" w:after="200" w:line="240" w:lineRule="auto"/>
+        <w:jc w:val="right"/>
         <w:rPr>
           <w:rFonts w:ascii="Segoe UI" w:hAnsi="Segoe UI" w:cs="Segoe UI"/>
           <w:b/>
@@ -3571,8 +3661,8 @@
     </w:p>
     <w:p>
       <w:pPr>
-        <w:bidi/>
         <w:spacing w:line="240" w:lineRule="auto"/>
+        <w:jc w:val="right"/>
         <w:rPr>
           <w:rFonts w:ascii="Segoe UI" w:hAnsi="Segoe UI" w:cs="Segoe UI"/>
           <w:color w:val="212121"/>
@@ -3601,8 +3691,8 @@
           <w:ilvl w:val="0"/>
           <w:numId w:val="7"/>
         </w:numPr>
-        <w:bidi/>
-        <w:spacing w:after="80" w:line="240" w:lineRule="auto"/>
+        <w:spacing w:after="80" w:line="240" w:lineRule="auto"/>
+        <w:jc w:val="right"/>
         <w:rPr>
           <w:rFonts w:ascii="Segoe UI" w:hAnsi="Segoe UI" w:cs="Segoe UI"/>
           <w:color w:val="212121"/>
@@ -3626,9 +3716,9 @@
     </w:p>
     <w:p>
       <w:pPr>
-        <w:bidi/>
         <w:spacing w:after="80" w:line="240" w:lineRule="auto"/>
         <w:ind w:left="360"/>
+        <w:jc w:val="right"/>
         <w:rPr>
           <w:rFonts w:ascii="Segoe UI" w:hAnsi="Segoe UI" w:cs="Segoe UI"/>
           <w:color w:val="212121"/>
@@ -3657,8 +3747,8 @@
           <w:ilvl w:val="0"/>
           <w:numId w:val="7"/>
         </w:numPr>
-        <w:bidi/>
-        <w:spacing w:after="80" w:line="240" w:lineRule="auto"/>
+        <w:spacing w:after="80" w:line="240" w:lineRule="auto"/>
+        <w:jc w:val="right"/>
         <w:rPr>
           <w:rFonts w:ascii="Segoe UI" w:hAnsi="Segoe UI" w:cs="Segoe UI"/>
           <w:color w:val="212121"/>
@@ -3682,9 +3772,9 @@
     </w:p>
     <w:p>
       <w:pPr>
-        <w:bidi/>
         <w:spacing w:after="80" w:line="240" w:lineRule="auto"/>
         <w:ind w:left="360"/>
+        <w:jc w:val="right"/>
         <w:rPr>
           <w:rFonts w:ascii="Segoe UI" w:hAnsi="Segoe UI" w:cs="Segoe UI"/>
           <w:color w:val="212121"/>
@@ -3713,8 +3803,8 @@
           <w:ilvl w:val="0"/>
           <w:numId w:val="7"/>
         </w:numPr>
-        <w:bidi/>
-        <w:spacing w:after="80" w:line="240" w:lineRule="auto"/>
+        <w:spacing w:after="80" w:line="240" w:lineRule="auto"/>
+        <w:jc w:val="right"/>
         <w:rPr>
           <w:rFonts w:ascii="Segoe UI" w:hAnsi="Segoe UI" w:cs="Segoe UI"/>
           <w:color w:val="212121"/>
@@ -3738,9 +3828,9 @@
     </w:p>
     <w:p>
       <w:pPr>
-        <w:bidi/>
         <w:spacing w:after="80" w:line="240" w:lineRule="auto"/>
         <w:ind w:left="360"/>
+        <w:jc w:val="right"/>
         <w:rPr>
           <w:rFonts w:ascii="Segoe UI" w:hAnsi="Segoe UI" w:cs="Segoe UI"/>
           <w:color w:val="212121"/>
@@ -3769,57 +3859,57 @@
           <w:ilvl w:val="0"/>
           <w:numId w:val="7"/>
         </w:numPr>
-        <w:bidi/>
-        <w:spacing w:after="80" w:line="240" w:lineRule="auto"/>
-        <w:rPr>
-          <w:rFonts w:ascii="Segoe UI" w:hAnsi="Segoe UI" w:cs="Segoe UI"/>
-          <w:color w:val="212121"/>
-        </w:rPr>
-      </w:pPr>
-      <w:r>
-        <w:rPr>
-          <w:rFonts w:ascii="Segoe UI" w:hAnsi="Segoe UI" w:cs="Segoe UI"/>
-          <w:color w:val="212121"/>
-          <w:rtl/>
-        </w:rPr>
-        <w:t>تصدير أي تقرير إلى</w:t>
-      </w:r>
-      <w:r>
-        <w:rPr>
-          <w:rFonts w:ascii="Segoe UI" w:hAnsi="Segoe UI" w:cs="Segoe UI"/>
-          <w:color w:val="212121"/>
-        </w:rPr>
-        <w:t xml:space="preserve"> Excel </w:t>
-      </w:r>
-      <w:r>
-        <w:rPr>
-          <w:rFonts w:ascii="Segoe UI" w:hAnsi="Segoe UI" w:cs="Segoe UI"/>
-          <w:color w:val="212121"/>
-          <w:rtl/>
-        </w:rPr>
-        <w:t>أو</w:t>
-      </w:r>
-      <w:r>
-        <w:rPr>
-          <w:rFonts w:ascii="Segoe UI" w:hAnsi="Segoe UI" w:cs="Segoe UI"/>
-          <w:color w:val="212121"/>
-        </w:rPr>
-        <w:t xml:space="preserve"> PDF </w:t>
-      </w:r>
-      <w:r>
-        <w:rPr>
-          <w:rFonts w:ascii="Segoe UI" w:hAnsi="Segoe UI" w:cs="Segoe UI"/>
-          <w:color w:val="212121"/>
-          <w:rtl/>
-        </w:rPr>
-        <w:t>بضغطة زر</w:t>
-      </w:r>
-      <w:r>
-        <w:rPr>
-          <w:rFonts w:ascii="Segoe UI" w:hAnsi="Segoe UI" w:cs="Segoe UI"/>
-          <w:color w:val="212121"/>
-        </w:rPr>
-        <w:t>.</w:t>
+        <w:spacing w:after="80" w:line="240" w:lineRule="auto"/>
+        <w:jc w:val="right"/>
+        <w:rPr>
+          <w:rFonts w:ascii="Segoe UI" w:hAnsi="Segoe UI" w:cs="Segoe UI"/>
+          <w:color w:val="212121"/>
+        </w:rPr>
+      </w:pPr>
+      <w:r>
+        <w:rPr>
+          <w:rFonts w:ascii="Segoe UI" w:hAnsi="Segoe UI" w:cs="Segoe UI"/>
+          <w:color w:val="212121"/>
+          <w:rtl/>
+        </w:rPr>
+        <w:t>تصدير أي تقرير إلى Excel أو PDF بضغطة زر، ويصدر التقرير بلغة الواجهة (عربي/إنجليزي) بتصميم منسّق: ترويسة وردية واتجاه RTL في Excel العربي وخط عربي مضمّن (Tajawal) وأرقام عربية في PDF.</w:t>
+      </w:r>
+      <w:r>
+        <w:rPr>
+          <w:rFonts w:ascii="Segoe UI" w:hAnsi="Segoe UI" w:cs="Segoe UI"/>
+          <w:color w:val="212121"/>
+        </w:rPr>
+        <w:t xml:space="preserve"/>
+      </w:r>
+      <w:r>
+        <w:rPr>
+          <w:rFonts w:ascii="Segoe UI" w:hAnsi="Segoe UI" w:cs="Segoe UI"/>
+          <w:color w:val="212121"/>
+          <w:rtl/>
+        </w:rPr>
+        <w:t/>
+      </w:r>
+      <w:r>
+        <w:rPr>
+          <w:rFonts w:ascii="Segoe UI" w:hAnsi="Segoe UI" w:cs="Segoe UI"/>
+          <w:color w:val="212121"/>
+        </w:rPr>
+        <w:t xml:space="preserve"/>
+      </w:r>
+      <w:r>
+        <w:rPr>
+          <w:rFonts w:ascii="Segoe UI" w:hAnsi="Segoe UI" w:cs="Segoe UI"/>
+          <w:color w:val="212121"/>
+          <w:rtl/>
+        </w:rPr>
+        <w:t/>
+      </w:r>
+      <w:r>
+        <w:rPr>
+          <w:rFonts w:ascii="Segoe UI" w:hAnsi="Segoe UI" w:cs="Segoe UI"/>
+          <w:color w:val="212121"/>
+        </w:rPr>
+        <w:t/>
       </w:r>
     </w:p>
     <w:p>
@@ -3829,8 +3919,8 @@
           <w:ilvl w:val="0"/>
           <w:numId w:val="7"/>
         </w:numPr>
-        <w:bidi/>
         <w:spacing w:before="280" w:after="200" w:line="240" w:lineRule="auto"/>
+        <w:jc w:val="right"/>
         <w:rPr>
           <w:rFonts w:ascii="Segoe UI" w:hAnsi="Segoe UI" w:cs="Segoe UI"/>
           <w:color w:val="212121"/>
@@ -3863,8 +3953,8 @@
           <w:ilvl w:val="0"/>
           <w:numId w:val="7"/>
         </w:numPr>
-        <w:bidi/>
         <w:spacing w:line="240" w:lineRule="auto"/>
+        <w:jc w:val="right"/>
         <w:rPr>
           <w:rFonts w:ascii="Segoe UI" w:hAnsi="Segoe UI" w:cs="Segoe UI"/>
           <w:color w:val="212121"/>
@@ -3888,9 +3978,9 @@
     </w:p>
     <w:p>
       <w:pPr>
-        <w:bidi/>
         <w:spacing w:after="80" w:line="240" w:lineRule="auto"/>
         <w:ind w:left="360"/>
+        <w:jc w:val="right"/>
         <w:rPr>
           <w:rFonts w:ascii="Segoe UI" w:hAnsi="Segoe UI" w:cs="Segoe UI"/>
           <w:color w:val="212121"/>
@@ -3934,8 +4024,8 @@
           <w:ilvl w:val="0"/>
           <w:numId w:val="8"/>
         </w:numPr>
-        <w:bidi/>
-        <w:spacing w:after="80" w:line="240" w:lineRule="auto"/>
+        <w:spacing w:after="80" w:line="240" w:lineRule="auto"/>
+        <w:jc w:val="right"/>
         <w:rPr>
           <w:rFonts w:ascii="Segoe UI" w:hAnsi="Segoe UI" w:cs="Segoe UI"/>
           <w:color w:val="212121"/>
@@ -3959,9 +4049,9 @@
     </w:p>
     <w:p>
       <w:pPr>
-        <w:bidi/>
         <w:spacing w:after="80" w:line="240" w:lineRule="auto"/>
         <w:ind w:left="360"/>
+        <w:jc w:val="right"/>
         <w:rPr>
           <w:rFonts w:ascii="Segoe UI" w:hAnsi="Segoe UI" w:cs="Segoe UI"/>
           <w:color w:val="212121"/>
@@ -3990,8 +4080,8 @@
           <w:ilvl w:val="0"/>
           <w:numId w:val="8"/>
         </w:numPr>
-        <w:bidi/>
-        <w:spacing w:after="80" w:line="240" w:lineRule="auto"/>
+        <w:spacing w:after="80" w:line="240" w:lineRule="auto"/>
+        <w:jc w:val="right"/>
         <w:rPr>
           <w:rFonts w:ascii="Segoe UI" w:hAnsi="Segoe UI" w:cs="Segoe UI"/>
           <w:color w:val="212121"/>
@@ -4052,9 +4142,9 @@
     </w:p>
     <w:p>
       <w:pPr>
-        <w:bidi/>
         <w:spacing w:after="80" w:line="240" w:lineRule="auto"/>
         <w:ind w:left="360"/>
+        <w:jc w:val="right"/>
         <w:rPr>
           <w:rFonts w:ascii="Segoe UI" w:hAnsi="Segoe UI" w:cs="Segoe UI"/>
           <w:color w:val="212121"/>
@@ -4083,8 +4173,8 @@
           <w:ilvl w:val="0"/>
           <w:numId w:val="8"/>
         </w:numPr>
-        <w:bidi/>
-        <w:spacing w:after="80" w:line="240" w:lineRule="auto"/>
+        <w:spacing w:after="80" w:line="240" w:lineRule="auto"/>
+        <w:jc w:val="right"/>
         <w:rPr>
           <w:rFonts w:ascii="Segoe UI" w:hAnsi="Segoe UI" w:cs="Segoe UI"/>
           <w:color w:val="212121"/>
@@ -4108,21 +4198,20 @@
     </w:p>
     <w:p>
       <w:pPr>
-        <w:bidi/>
         <w:spacing w:after="80" w:line="240" w:lineRule="auto"/>
         <w:ind w:left="360"/>
-        <w:rPr>
-          <w:rFonts w:ascii="Segoe UI" w:hAnsi="Segoe UI" w:cs="Segoe UI"/>
-          <w:color w:val="212121"/>
-        </w:rPr>
-      </w:pPr>
-      <w:r>
-        <w:rPr>
-          <w:rFonts w:ascii="Segoe UI" w:hAnsi="Segoe UI" w:cs="Segoe UI"/>
-          <w:color w:val="212121"/>
-          <w:rtl/>
-        </w:rPr>
-        <w:lastRenderedPageBreak/>
+        <w:jc w:val="right"/>
+        <w:rPr>
+          <w:rFonts w:ascii="Segoe UI" w:hAnsi="Segoe UI" w:cs="Segoe UI"/>
+          <w:color w:val="212121"/>
+        </w:rPr>
+      </w:pPr>
+      <w:r>
+        <w:rPr>
+          <w:rFonts w:ascii="Segoe UI" w:hAnsi="Segoe UI" w:cs="Segoe UI"/>
+          <w:color w:val="212121"/>
+          <w:rtl/>
+        </w:rPr>
         <w:t>المستخدمون: إدارة حسابات الدخول والصلاحيات</w:t>
       </w:r>
       <w:r>
@@ -4135,9 +4224,9 @@
     </w:p>
     <w:p>
       <w:pPr>
-        <w:bidi/>
         <w:spacing w:before="280" w:after="200" w:line="240" w:lineRule="auto"/>
         <w:ind w:left="360"/>
+        <w:jc w:val="right"/>
         <w:rPr>
           <w:rFonts w:ascii="Segoe UI" w:hAnsi="Segoe UI" w:cs="Segoe UI"/>
           <w:b/>
@@ -4168,9 +4257,9 @@
     </w:p>
     <w:p>
       <w:pPr>
-        <w:bidi/>
         <w:spacing w:line="240" w:lineRule="auto"/>
         <w:ind w:left="360"/>
+        <w:jc w:val="right"/>
         <w:rPr>
           <w:rFonts w:ascii="Segoe UI" w:hAnsi="Segoe UI" w:cs="Segoe UI"/>
           <w:color w:val="212121"/>
@@ -4194,9 +4283,9 @@
     </w:p>
     <w:p>
       <w:pPr>
-        <w:bidi/>
         <w:spacing w:before="280" w:after="200" w:line="240" w:lineRule="auto"/>
         <w:ind w:left="360"/>
+        <w:jc w:val="right"/>
         <w:rPr>
           <w:rFonts w:ascii="Segoe UI" w:hAnsi="Segoe UI" w:cs="Segoe UI"/>
           <w:b/>
@@ -4227,9 +4316,9 @@
     </w:p>
     <w:p>
       <w:pPr>
-        <w:bidi/>
         <w:spacing w:line="240" w:lineRule="auto"/>
         <w:ind w:left="360"/>
+        <w:jc w:val="right"/>
         <w:rPr>
           <w:rFonts w:ascii="Segoe UI" w:hAnsi="Segoe UI" w:cs="Segoe UI"/>
           <w:color w:val="212121"/>
@@ -4258,8 +4347,8 @@
           <w:ilvl w:val="0"/>
           <w:numId w:val="8"/>
         </w:numPr>
-        <w:bidi/>
-        <w:spacing w:after="80" w:line="240" w:lineRule="auto"/>
+        <w:spacing w:after="80" w:line="240" w:lineRule="auto"/>
+        <w:jc w:val="right"/>
         <w:rPr>
           <w:rFonts w:ascii="Segoe UI" w:hAnsi="Segoe UI" w:cs="Segoe UI"/>
           <w:color w:val="212121"/>
@@ -4283,9 +4372,9 @@
     </w:p>
     <w:p>
       <w:pPr>
-        <w:bidi/>
         <w:spacing w:after="80" w:line="240" w:lineRule="auto"/>
         <w:ind w:left="360"/>
+        <w:jc w:val="right"/>
         <w:rPr>
           <w:rFonts w:ascii="Segoe UI" w:hAnsi="Segoe UI" w:cs="Segoe UI"/>
           <w:color w:val="212121"/>
@@ -4314,8 +4403,8 @@
           <w:ilvl w:val="0"/>
           <w:numId w:val="8"/>
         </w:numPr>
-        <w:bidi/>
-        <w:spacing w:after="80" w:line="240" w:lineRule="auto"/>
+        <w:spacing w:after="80" w:line="240" w:lineRule="auto"/>
+        <w:jc w:val="right"/>
         <w:rPr>
           <w:rFonts w:ascii="Segoe UI" w:hAnsi="Segoe UI" w:cs="Segoe UI"/>
           <w:color w:val="212121"/>
@@ -4344,8 +4433,8 @@
           <w:ilvl w:val="0"/>
           <w:numId w:val="8"/>
         </w:numPr>
-        <w:bidi/>
         <w:spacing w:line="240" w:lineRule="auto"/>
+        <w:jc w:val="right"/>
         <w:rPr>
           <w:rFonts w:ascii="Segoe UI" w:hAnsi="Segoe UI" w:cs="Segoe UI"/>
           <w:color w:val="212121"/>
@@ -4369,9 +4458,9 @@
     </w:p>
     <w:p>
       <w:pPr>
-        <w:bidi/>
         <w:spacing w:after="80" w:line="240" w:lineRule="auto"/>
         <w:ind w:left="360"/>
+        <w:jc w:val="right"/>
         <w:rPr>
           <w:rFonts w:ascii="Segoe UI" w:hAnsi="Segoe UI" w:cs="Segoe UI"/>
           <w:color w:val="212121"/>
@@ -4400,8 +4489,8 @@
           <w:ilvl w:val="0"/>
           <w:numId w:val="9"/>
         </w:numPr>
-        <w:bidi/>
-        <w:spacing w:after="80" w:line="240" w:lineRule="auto"/>
+        <w:spacing w:after="80" w:line="240" w:lineRule="auto"/>
+        <w:jc w:val="right"/>
         <w:rPr>
           <w:rFonts w:ascii="Segoe UI" w:hAnsi="Segoe UI" w:cs="Segoe UI"/>
           <w:color w:val="212121"/>
@@ -4440,9 +4529,9 @@
     </w:p>
     <w:p>
       <w:pPr>
-        <w:bidi/>
         <w:spacing w:after="80" w:line="240" w:lineRule="auto"/>
         <w:ind w:left="360"/>
+        <w:jc w:val="right"/>
         <w:rPr>
           <w:rFonts w:ascii="Segoe UI" w:hAnsi="Segoe UI" w:cs="Segoe UI"/>
           <w:color w:val="212121"/>
@@ -4466,9 +4555,9 @@
     </w:p>
     <w:p>
       <w:pPr>
-        <w:bidi/>
         <w:spacing w:before="120" w:line="240" w:lineRule="auto"/>
         <w:ind w:left="560"/>
+        <w:jc w:val="right"/>
         <w:rPr>
           <w:rFonts w:ascii="Segoe UI" w:hAnsi="Segoe UI" w:cs="Segoe UI"/>
           <w:i/>
@@ -4495,8 +4584,8 @@
     </w:p>
     <w:p>
       <w:pPr>
-        <w:bidi/>
         <w:spacing w:before="160" w:after="120" w:line="240" w:lineRule="auto"/>
+        <w:jc w:val="right"/>
         <w:rPr>
           <w:rFonts w:ascii="Segoe UI" w:hAnsi="Segoe UI" w:cs="Segoe UI"/>
           <w:b/>
@@ -4523,8 +4612,8 @@
           <w:ilvl w:val="0"/>
           <w:numId w:val="9"/>
         </w:numPr>
-        <w:bidi/>
-        <w:spacing w:after="80" w:line="240" w:lineRule="auto"/>
+        <w:spacing w:after="80" w:line="240" w:lineRule="auto"/>
+        <w:jc w:val="right"/>
         <w:rPr>
           <w:rFonts w:ascii="Segoe UI" w:hAnsi="Segoe UI" w:cs="Segoe UI"/>
           <w:b/>
@@ -4550,9 +4639,9 @@
     </w:p>
     <w:p>
       <w:pPr>
-        <w:bidi/>
         <w:spacing w:after="80" w:line="240" w:lineRule="auto"/>
         <w:ind w:left="360"/>
+        <w:jc w:val="right"/>
         <w:rPr>
           <w:rFonts w:ascii="Segoe UI" w:hAnsi="Segoe UI" w:cs="Segoe UI"/>
           <w:color w:val="212121"/>
@@ -4576,9 +4665,9 @@
     </w:p>
     <w:p>
       <w:pPr>
-        <w:bidi/>
         <w:spacing w:before="280" w:after="200" w:line="240" w:lineRule="auto"/>
         <w:ind w:left="360"/>
+        <w:jc w:val="right"/>
         <w:rPr>
           <w:rFonts w:ascii="Segoe UI" w:hAnsi="Segoe UI" w:cs="Segoe UI"/>
           <w:b/>
@@ -4614,8 +4703,8 @@
           <w:ilvl w:val="0"/>
           <w:numId w:val="9"/>
         </w:numPr>
-        <w:bidi/>
-        <w:spacing w:after="80" w:line="240" w:lineRule="auto"/>
+        <w:spacing w:after="80" w:line="240" w:lineRule="auto"/>
+        <w:jc w:val="right"/>
         <w:rPr>
           <w:rFonts w:ascii="Segoe UI" w:hAnsi="Segoe UI" w:cs="Segoe UI"/>
           <w:b/>
@@ -4641,9 +4730,9 @@
     </w:p>
     <w:p>
       <w:pPr>
-        <w:bidi/>
         <w:spacing w:after="80" w:line="240" w:lineRule="auto"/>
         <w:ind w:left="360"/>
+        <w:jc w:val="right"/>
         <w:rPr>
           <w:rFonts w:ascii="Segoe UI" w:hAnsi="Segoe UI" w:cs="Segoe UI"/>
           <w:color w:val="212121"/>
@@ -4672,8 +4761,8 @@
           <w:ilvl w:val="0"/>
           <w:numId w:val="9"/>
         </w:numPr>
-        <w:bidi/>
-        <w:spacing w:after="80" w:line="240" w:lineRule="auto"/>
+        <w:spacing w:after="80" w:line="240" w:lineRule="auto"/>
+        <w:jc w:val="right"/>
         <w:rPr>
           <w:rFonts w:ascii="Segoe UI" w:hAnsi="Segoe UI" w:cs="Segoe UI"/>
           <w:color w:val="212121"/>
@@ -4702,8 +4791,8 @@
           <w:ilvl w:val="0"/>
           <w:numId w:val="9"/>
         </w:numPr>
-        <w:bidi/>
         <w:spacing w:before="280" w:after="200" w:line="240" w:lineRule="auto"/>
+        <w:jc w:val="right"/>
         <w:rPr>
           <w:rFonts w:ascii="Segoe UI" w:hAnsi="Segoe UI" w:cs="Segoe UI"/>
           <w:color w:val="212121"/>
@@ -4717,6 +4806,493 @@
           <w:sz w:val="36"/>
         </w:rPr>
         <w:t xml:space="preserve">20) </w:t>
+      </w:r>
+      <w:r>
+        <w:rPr>
+          <w:rFonts w:ascii="Segoe UI" w:hAnsi="Segoe UI" w:cs="Segoe UI"/>
+          <w:b/>
+          <w:color w:val="C2185B"/>
+          <w:sz w:val="36"/>
+          <w:rtl/>
+        </w:rPr>
+        <w:t>فحص البرنامج (جولة تعليمية</w:t>
+      </w:r>
+      <w:r>
+        <w:rPr>
+          <w:rFonts w:ascii="Segoe UI" w:hAnsi="Segoe UI" w:cs="Segoe UI"/>
+          <w:b/>
+          <w:color w:val="C2185B"/>
+          <w:sz w:val="36"/>
+        </w:rPr>
+        <w:t>)</w:t>
+      </w:r>
+    </w:p>
+    <w:p>
+      <w:pPr>
+        <w:pStyle w:val="ListParagraph"/>
+        <w:numPr>
+          <w:ilvl w:val="0"/>
+          <w:numId w:val="9"/>
+        </w:numPr>
+        <w:spacing w:line="240" w:lineRule="auto"/>
+        <w:jc w:val="right"/>
+        <w:rPr>
+          <w:rFonts w:ascii="Segoe UI" w:hAnsi="Segoe UI" w:cs="Segoe UI"/>
+          <w:color w:val="212121"/>
+        </w:rPr>
+      </w:pPr>
+      <w:r>
+        <w:rPr>
+          <w:rFonts w:ascii="Segoe UI" w:hAnsi="Segoe UI" w:cs="Segoe UI"/>
+          <w:color w:val="212121"/>
+          <w:rtl/>
+        </w:rPr>
+        <w:t>النظام حاليًا ممتلئ ببيانات تجريبية واقعية في كل صفحة لتستكشفها وتتعلم عليها قبل التشغيل الفعلي. إليك جولة مقترحة للفحص</w:t>
+      </w:r>
+      <w:r>
+        <w:rPr>
+          <w:rFonts w:ascii="Segoe UI" w:hAnsi="Segoe UI" w:cs="Segoe UI"/>
+          <w:color w:val="212121"/>
+        </w:rPr>
+        <w:t>:</w:t>
+      </w:r>
+    </w:p>
+    <w:p>
+      <w:pPr>
+        <w:spacing w:after="80" w:line="240" w:lineRule="auto"/>
+        <w:ind w:left="360"/>
+        <w:jc w:val="right"/>
+        <w:rPr>
+          <w:rFonts w:ascii="Segoe UI" w:hAnsi="Segoe UI" w:cs="Segoe UI"/>
+          <w:color w:val="212121"/>
+        </w:rPr>
+      </w:pPr>
+      <w:r>
+        <w:rPr>
+          <w:rFonts w:ascii="Segoe UI" w:hAnsi="Segoe UI" w:cs="Segoe UI"/>
+          <w:color w:val="212121"/>
+          <w:rtl/>
+        </w:rPr>
+        <w:t>الوردية في الشريط العلوي: زر أحمر يعرض الوردية المفتوحة (مبيعات ونقدية متوقعة) — جرّب إغلاقها ثم فتح وردية جديدة لفهم «المطابقة النقدية» (الفرق بين الرصيد المتوقع والفعلي)</w:t>
+      </w:r>
+      <w:r>
+        <w:rPr>
+          <w:rFonts w:ascii="Segoe UI" w:hAnsi="Segoe UI" w:cs="Segoe UI"/>
+          <w:color w:val="212121"/>
+        </w:rPr>
+        <w:t>.</w:t>
+      </w:r>
+    </w:p>
+    <w:p>
+      <w:pPr>
+        <w:pStyle w:val="ListParagraph"/>
+        <w:numPr>
+          <w:ilvl w:val="0"/>
+          <w:numId w:val="10"/>
+        </w:numPr>
+        <w:spacing w:after="80" w:line="240" w:lineRule="auto"/>
+        <w:jc w:val="right"/>
+        <w:rPr>
+          <w:rFonts w:ascii="Segoe UI" w:hAnsi="Segoe UI" w:cs="Segoe UI"/>
+          <w:color w:val="212121"/>
+        </w:rPr>
+      </w:pPr>
+      <w:r>
+        <w:rPr>
+          <w:rFonts w:ascii="Segoe UI" w:hAnsi="Segoe UI" w:cs="Segoe UI"/>
+          <w:color w:val="212121"/>
+          <w:rtl/>
+        </w:rPr>
+        <w:t>نقطة البيع: بيع خدمة + منتج + مشروب كافيتيريا لنفس العميلة، ثم اطبع الإيصال</w:t>
+      </w:r>
+      <w:r>
+        <w:rPr>
+          <w:rFonts w:ascii="Segoe UI" w:hAnsi="Segoe UI" w:cs="Segoe UI"/>
+          <w:color w:val="212121"/>
+        </w:rPr>
+        <w:t xml:space="preserve"> (</w:t>
+      </w:r>
+      <w:r>
+        <w:rPr>
+          <w:rFonts w:ascii="Segoe UI" w:hAnsi="Segoe UI" w:cs="Segoe UI"/>
+          <w:color w:val="212121"/>
+          <w:rtl/>
+        </w:rPr>
+        <w:t>يتضمن رمز</w:t>
+      </w:r>
+      <w:r>
+        <w:rPr>
+          <w:rFonts w:ascii="Segoe UI" w:hAnsi="Segoe UI" w:cs="Segoe UI"/>
+          <w:color w:val="212121"/>
+        </w:rPr>
+        <w:t xml:space="preserve"> QR </w:t>
+      </w:r>
+      <w:r>
+        <w:rPr>
+          <w:rFonts w:ascii="Segoe UI" w:hAnsi="Segoe UI" w:cs="Segoe UI"/>
+          <w:color w:val="212121"/>
+          <w:rtl/>
+        </w:rPr>
+        <w:t>للفوترة الإلكترونية</w:t>
+      </w:r>
+      <w:r>
+        <w:rPr>
+          <w:rFonts w:ascii="Segoe UI" w:hAnsi="Segoe UI" w:cs="Segoe UI"/>
+          <w:color w:val="212121"/>
+        </w:rPr>
+        <w:t>).</w:t>
+      </w:r>
+    </w:p>
+    <w:p>
+      <w:pPr>
+        <w:spacing w:after="80" w:line="240" w:lineRule="auto"/>
+        <w:ind w:left="360"/>
+        <w:jc w:val="right"/>
+        <w:rPr>
+          <w:rFonts w:ascii="Segoe UI" w:hAnsi="Segoe UI" w:cs="Segoe UI"/>
+          <w:color w:val="212121"/>
+        </w:rPr>
+      </w:pPr>
+      <w:r>
+        <w:rPr>
+          <w:rFonts w:ascii="Segoe UI" w:hAnsi="Segoe UI" w:cs="Segoe UI"/>
+          <w:color w:val="212121"/>
+          <w:rtl/>
+        </w:rPr>
+        <w:t>التقارير: اختر الفرع أو الفترة من الأعلى وشغّل التصدير Excel أو PDF (يتبع لغة الواجهة عربي/إنجليزي).</w:t>
+      </w:r>
+      <w:r>
+        <w:rPr>
+          <w:rFonts w:ascii="Segoe UI" w:hAnsi="Segoe UI" w:cs="Segoe UI"/>
+          <w:color w:val="212121"/>
+        </w:rPr>
+        <w:t xml:space="preserve"/>
+      </w:r>
+      <w:r>
+        <w:rPr>
+          <w:rFonts w:ascii="Segoe UI" w:hAnsi="Segoe UI" w:cs="Segoe UI"/>
+          <w:color w:val="212121"/>
+          <w:rtl/>
+        </w:rPr>
+        <w:t/>
+      </w:r>
+      <w:r>
+        <w:rPr>
+          <w:rFonts w:ascii="Segoe UI" w:hAnsi="Segoe UI" w:cs="Segoe UI"/>
+          <w:color w:val="212121"/>
+        </w:rPr>
+        <w:t xml:space="preserve"/>
+      </w:r>
+    </w:p>
+    <w:p>
+      <w:pPr>
+        <w:pStyle w:val="ListParagraph"/>
+        <w:numPr>
+          <w:ilvl w:val="0"/>
+          <w:numId w:val="10"/>
+        </w:numPr>
+        <w:spacing w:after="80" w:line="240" w:lineRule="auto"/>
+        <w:jc w:val="right"/>
+        <w:rPr>
+          <w:rFonts w:ascii="Segoe UI" w:hAnsi="Segoe UI" w:cs="Segoe UI"/>
+          <w:color w:val="212121"/>
+        </w:rPr>
+      </w:pPr>
+      <w:r>
+        <w:rPr>
+          <w:rFonts w:ascii="Segoe UI" w:hAnsi="Segoe UI" w:cs="Segoe UI"/>
+          <w:color w:val="212121"/>
+          <w:rtl/>
+        </w:rPr>
+        <w:t>المخزون: توجد منتجات منخفضة المخزون ونافدة (ماسك شعر، كريم أساس) — ستظهر في تنبيهات لوحة التحكم</w:t>
+      </w:r>
+      <w:r>
+        <w:rPr>
+          <w:rFonts w:ascii="Segoe UI" w:hAnsi="Segoe UI" w:cs="Segoe UI"/>
+          <w:color w:val="212121"/>
+        </w:rPr>
+        <w:t>.</w:t>
+      </w:r>
+    </w:p>
+    <w:p>
+      <w:pPr>
+        <w:spacing w:after="80" w:line="240" w:lineRule="auto"/>
+        <w:ind w:left="360"/>
+        <w:jc w:val="right"/>
+        <w:rPr>
+          <w:rFonts w:ascii="Segoe UI" w:hAnsi="Segoe UI" w:cs="Segoe UI"/>
+          <w:color w:val="212121"/>
+        </w:rPr>
+      </w:pPr>
+      <w:r>
+        <w:rPr>
+          <w:rFonts w:ascii="Segoe UI" w:hAnsi="Segoe UI" w:cs="Segoe UI"/>
+          <w:color w:val="212121"/>
+          <w:rtl/>
+        </w:rPr>
+        <w:t>المواعيد: التقويم الأسبوعي يعرض مواعيد الحاضر/المؤجل/المنجز/الملغي مع رسوم الإلغاء</w:t>
+      </w:r>
+      <w:r>
+        <w:rPr>
+          <w:rFonts w:ascii="Segoe UI" w:hAnsi="Segoe UI" w:cs="Segoe UI"/>
+          <w:color w:val="212121"/>
+        </w:rPr>
+        <w:t>.</w:t>
+      </w:r>
+    </w:p>
+    <w:p>
+      <w:pPr>
+        <w:pStyle w:val="ListParagraph"/>
+        <w:numPr>
+          <w:ilvl w:val="0"/>
+          <w:numId w:val="10"/>
+        </w:numPr>
+        <w:spacing w:after="80" w:line="240" w:lineRule="auto"/>
+        <w:jc w:val="right"/>
+        <w:rPr>
+          <w:rFonts w:ascii="Segoe UI" w:hAnsi="Segoe UI" w:cs="Segoe UI"/>
+          <w:color w:val="212121"/>
+        </w:rPr>
+      </w:pPr>
+      <w:r>
+        <w:rPr>
+          <w:rFonts w:ascii="Segoe UI" w:hAnsi="Segoe UI" w:cs="Segoe UI"/>
+          <w:color w:val="212121"/>
+          <w:rtl/>
+        </w:rPr>
+        <w:t>المستخدمون: جرّب تسجيل الدخول بحساب الموظفة</w:t>
+      </w:r>
+      <w:r>
+        <w:rPr>
+          <w:rFonts w:ascii="Segoe UI" w:hAnsi="Segoe UI" w:cs="Segoe UI"/>
+          <w:color w:val="212121"/>
+        </w:rPr>
+        <w:t xml:space="preserve"> reception / pass123 </w:t>
+      </w:r>
+      <w:r>
+        <w:rPr>
+          <w:rFonts w:ascii="Segoe UI" w:hAnsi="Segoe UI" w:cs="Segoe UI"/>
+          <w:color w:val="212121"/>
+          <w:rtl/>
+        </w:rPr>
+        <w:t>لترى الفرق في الصلاحيات عن حساب المدير</w:t>
+      </w:r>
+      <w:r>
+        <w:rPr>
+          <w:rFonts w:ascii="Segoe UI" w:hAnsi="Segoe UI" w:cs="Segoe UI"/>
+          <w:color w:val="212121"/>
+        </w:rPr>
+        <w:t>.</w:t>
+      </w:r>
+    </w:p>
+    <w:p>
+      <w:pPr>
+        <w:spacing w:after="80" w:line="240" w:lineRule="auto"/>
+        <w:ind w:left="360"/>
+        <w:jc w:val="right"/>
+        <w:rPr>
+          <w:rFonts w:ascii="Segoe UI" w:hAnsi="Segoe UI" w:cs="Segoe UI"/>
+          <w:color w:val="212121"/>
+        </w:rPr>
+      </w:pPr>
+      <w:r>
+        <w:rPr>
+          <w:rFonts w:ascii="Segoe UI" w:hAnsi="Segoe UI" w:cs="Segoe UI"/>
+          <w:color w:val="212121"/>
+          <w:rtl/>
+        </w:rPr>
+        <w:t>الإشعارات: أرسل حملة واتساب تجريبية (تعمل بالمحاكاة) وراقب سجل الإشعارات والجدولة التلقائية</w:t>
+      </w:r>
+      <w:r>
+        <w:rPr>
+          <w:rFonts w:ascii="Segoe UI" w:hAnsi="Segoe UI" w:cs="Segoe UI"/>
+          <w:color w:val="212121"/>
+        </w:rPr>
+        <w:t>.</w:t>
+      </w:r>
+    </w:p>
+    <w:p>
+      <w:pPr>
+        <w:pStyle w:val="ListParagraph"/>
+        <w:numPr>
+          <w:ilvl w:val="0"/>
+          <w:numId w:val="10"/>
+        </w:numPr>
+        <w:spacing w:after="80" w:line="240" w:lineRule="auto"/>
+        <w:jc w:val="right"/>
+        <w:rPr>
+          <w:rFonts w:ascii="Segoe UI" w:hAnsi="Segoe UI" w:cs="Segoe UI"/>
+          <w:color w:val="212121"/>
+        </w:rPr>
+      </w:pPr>
+      <w:r>
+        <w:rPr>
+          <w:rFonts w:ascii="Segoe UI" w:hAnsi="Segoe UI" w:cs="Segoe UI"/>
+          <w:color w:val="212121"/>
+          <w:rtl/>
+        </w:rPr>
+        <w:t>الفوترة الإلكترونية: من الإعدادات تبويب</w:t>
+      </w:r>
+      <w:r>
+        <w:rPr>
+          <w:rFonts w:ascii="Segoe UI" w:hAnsi="Segoe UI" w:cs="Segoe UI"/>
+          <w:color w:val="212121"/>
+        </w:rPr>
+        <w:t xml:space="preserve"> ZATCA </w:t>
+      </w:r>
+      <w:r>
+        <w:rPr>
+          <w:rFonts w:ascii="Segoe UI" w:hAnsi="Segoe UI" w:cs="Segoe UI"/>
+          <w:color w:val="212121"/>
+          <w:rtl/>
+        </w:rPr>
+        <w:t>يعرض حالة الشهادة — جرّب نقاط</w:t>
+      </w:r>
+      <w:r>
+        <w:rPr>
+          <w:rFonts w:ascii="Segoe UI" w:hAnsi="Segoe UI" w:cs="Segoe UI"/>
+          <w:color w:val="212121"/>
+        </w:rPr>
+        <w:t xml:space="preserve"> test </w:t>
+      </w:r>
+      <w:r>
+        <w:rPr>
+          <w:rFonts w:ascii="Segoe UI" w:hAnsi="Segoe UI" w:cs="Segoe UI"/>
+          <w:color w:val="212121"/>
+          <w:rtl/>
+        </w:rPr>
+        <w:t>و</w:t>
+      </w:r>
+      <w:r>
+        <w:rPr>
+          <w:rFonts w:ascii="Segoe UI" w:hAnsi="Segoe UI" w:cs="Segoe UI"/>
+          <w:color w:val="212121"/>
+        </w:rPr>
+        <w:t xml:space="preserve">XML </w:t>
+      </w:r>
+      <w:r>
+        <w:rPr>
+          <w:rFonts w:ascii="Segoe UI" w:hAnsi="Segoe UI" w:cs="Segoe UI"/>
+          <w:color w:val="212121"/>
+          <w:rtl/>
+        </w:rPr>
+        <w:t>و</w:t>
+      </w:r>
+      <w:r>
+        <w:rPr>
+          <w:rFonts w:ascii="Segoe UI" w:hAnsi="Segoe UI" w:cs="Segoe UI"/>
+          <w:color w:val="212121"/>
+        </w:rPr>
+        <w:t>QR.</w:t>
+      </w:r>
+    </w:p>
+    <w:p>
+      <w:pPr>
+        <w:pStyle w:val="ListParagraph"/>
+        <w:numPr>
+          <w:ilvl w:val="0"/>
+          <w:numId w:val="10"/>
+        </w:numPr>
+        <w:spacing w:before="120" w:line="240" w:lineRule="auto"/>
+        <w:ind w:left="560"/>
+        <w:jc w:val="right"/>
+        <w:rPr>
+          <w:rFonts w:ascii="Segoe UI" w:hAnsi="Segoe UI" w:cs="Segoe UI"/>
+          <w:color w:val="212121"/>
+        </w:rPr>
+      </w:pPr>
+      <w:r>
+        <w:rPr>
+          <w:rFonts w:ascii="Segoe UI" w:hAnsi="Segoe UI" w:cs="Segoe UI"/>
+          <w:i/>
+          <w:color w:val="0066CC"/>
+          <w:rtl/>
+        </w:rPr>
+        <w:t>بيانات الدخول للتجربة</w:t>
+      </w:r>
+      <w:r>
+        <w:rPr>
+          <w:rFonts w:ascii="Segoe UI" w:hAnsi="Segoe UI" w:cs="Segoe UI"/>
+          <w:i/>
+          <w:color w:val="0066CC"/>
+        </w:rPr>
+        <w:t>: admin / admin1234 (</w:t>
+      </w:r>
+      <w:r>
+        <w:rPr>
+          <w:rFonts w:ascii="Segoe UI" w:hAnsi="Segoe UI" w:cs="Segoe UI"/>
+          <w:i/>
+          <w:color w:val="0066CC"/>
+          <w:rtl/>
+        </w:rPr>
+        <w:t>مدير</w:t>
+      </w:r>
+      <w:r>
+        <w:rPr>
+          <w:rFonts w:ascii="Segoe UI" w:hAnsi="Segoe UI" w:cs="Segoe UI"/>
+          <w:i/>
+          <w:color w:val="0066CC"/>
+        </w:rPr>
+        <w:t>)</w:t>
+      </w:r>
+      <w:r>
+        <w:rPr>
+          <w:rFonts w:ascii="Segoe UI" w:hAnsi="Segoe UI" w:cs="Segoe UI"/>
+          <w:i/>
+          <w:color w:val="0066CC"/>
+          <w:rtl/>
+        </w:rPr>
+        <w:t xml:space="preserve">، </w:t>
+      </w:r>
+      <w:r>
+        <w:rPr>
+          <w:rFonts w:ascii="Segoe UI" w:hAnsi="Segoe UI" w:cs="Segoe UI"/>
+          <w:i/>
+          <w:color w:val="0066CC"/>
+        </w:rPr>
+        <w:t>reception / pass123 (</w:t>
+      </w:r>
+      <w:r>
+        <w:rPr>
+          <w:rFonts w:ascii="Segoe UI" w:hAnsi="Segoe UI" w:cs="Segoe UI"/>
+          <w:i/>
+          <w:color w:val="0066CC"/>
+          <w:rtl/>
+        </w:rPr>
+        <w:t>موظفة استقبال</w:t>
+      </w:r>
+      <w:r>
+        <w:rPr>
+          <w:rFonts w:ascii="Segoe UI" w:hAnsi="Segoe UI" w:cs="Segoe UI"/>
+          <w:i/>
+          <w:color w:val="0066CC"/>
+        </w:rPr>
+        <w:t>).</w:t>
+      </w:r>
+    </w:p>
+    <w:p>
+      <w:pPr>
+        <w:pStyle w:val="ListParagraph"/>
+        <w:numPr>
+          <w:ilvl w:val="0"/>
+          <w:numId w:val="10"/>
+        </w:numPr>
+        <w:spacing w:before="280" w:after="200" w:line="240" w:lineRule="auto"/>
+        <w:ind w:left="0"/>
+        <w:jc w:val="right"/>
+        <w:rPr>
+          <w:rFonts w:ascii="Segoe UI" w:hAnsi="Segoe UI" w:cs="Segoe UI"/>
+          <w:color w:val="212121"/>
+        </w:rPr>
+      </w:pPr>
+      <w:r>
+        <w:rPr>
+          <w:rFonts w:ascii="Segoe UI" w:hAnsi="Segoe UI" w:cs="Segoe UI"/>
+          <w:b/>
+          <w:color w:val="C2185B"/>
+          <w:sz w:val="36"/>
+        </w:rPr>
+        <w:t xml:space="preserve">21) </w:t>
       </w:r>
       <w:r>
         <w:rPr>
@@ -4747,6 +5323,12 @@
         <w:gridCol w:w="5849"/>
       </w:tblGrid>
       <w:tr>
+        <w:tblPrEx>
+          <w:tblCellMar>
+            <w:top w:w="0" w:type="dxa"/>
+            <w:bottom w:w="0" w:type="dxa"/>
+          </w:tblCellMar>
+        </w:tblPrEx>
         <w:tc>
           <w:tcPr>
             <w:tcW w:w="0" w:type="auto"/>
@@ -4757,11 +5339,11 @@
               <w:pStyle w:val="ListParagraph"/>
               <w:numPr>
                 <w:ilvl w:val="0"/>
-                <w:numId w:val="9"/>
+                <w:numId w:val="10"/>
               </w:numPr>
-              <w:bidi/>
               <w:spacing w:before="280" w:after="0" w:line="240" w:lineRule="auto"/>
               <w:ind w:left="0" w:firstLine="0"/>
+              <w:jc w:val="right"/>
               <w:rPr>
                 <w:rFonts w:ascii="Segoe UI" w:hAnsi="Segoe UI" w:cs="Segoe UI"/>
                 <w:b/>
@@ -4791,11 +5373,11 @@
               <w:pStyle w:val="ListParagraph"/>
               <w:numPr>
                 <w:ilvl w:val="0"/>
-                <w:numId w:val="9"/>
+                <w:numId w:val="10"/>
               </w:numPr>
-              <w:bidi/>
               <w:spacing w:before="280" w:after="0" w:line="240" w:lineRule="auto"/>
               <w:ind w:left="0" w:firstLine="0"/>
+              <w:jc w:val="right"/>
               <w:rPr>
                 <w:rFonts w:ascii="Segoe UI" w:hAnsi="Segoe UI" w:cs="Segoe UI"/>
                 <w:b/>
@@ -4817,6 +5399,12 @@
         </w:tc>
       </w:tr>
       <w:tr>
+        <w:tblPrEx>
+          <w:tblCellMar>
+            <w:top w:w="0" w:type="dxa"/>
+            <w:bottom w:w="0" w:type="dxa"/>
+          </w:tblCellMar>
+        </w:tblPrEx>
         <w:tc>
           <w:tcPr>
             <w:tcW w:w="0" w:type="auto"/>
@@ -4827,11 +5415,11 @@
               <w:pStyle w:val="ListParagraph"/>
               <w:numPr>
                 <w:ilvl w:val="0"/>
-                <w:numId w:val="9"/>
+                <w:numId w:val="10"/>
               </w:numPr>
-              <w:bidi/>
               <w:spacing w:before="280" w:after="0" w:line="240" w:lineRule="auto"/>
               <w:ind w:left="0" w:firstLine="0"/>
+              <w:jc w:val="right"/>
               <w:rPr>
                 <w:rFonts w:ascii="Segoe UI" w:hAnsi="Segoe UI" w:cs="Segoe UI"/>
                 <w:color w:val="212121"/>
@@ -4845,7 +5433,6 @@
                 <w:sz w:val="20"/>
                 <w:rtl/>
               </w:rPr>
-              <w:lastRenderedPageBreak/>
               <w:t>الصفحة لا تفتح</w:t>
             </w:r>
           </w:p>
@@ -4860,11 +5447,11 @@
               <w:pStyle w:val="ListParagraph"/>
               <w:numPr>
                 <w:ilvl w:val="0"/>
-                <w:numId w:val="9"/>
+                <w:numId w:val="10"/>
               </w:numPr>
-              <w:bidi/>
               <w:spacing w:before="280" w:after="0" w:line="240" w:lineRule="auto"/>
               <w:ind w:left="0" w:firstLine="0"/>
+              <w:jc w:val="right"/>
               <w:rPr>
                 <w:rFonts w:ascii="Segoe UI" w:hAnsi="Segoe UI" w:cs="Segoe UI"/>
                 <w:color w:val="212121"/>
@@ -4884,6 +5471,12 @@
         </w:tc>
       </w:tr>
       <w:tr>
+        <w:tblPrEx>
+          <w:tblCellMar>
+            <w:top w:w="0" w:type="dxa"/>
+            <w:bottom w:w="0" w:type="dxa"/>
+          </w:tblCellMar>
+        </w:tblPrEx>
         <w:tc>
           <w:tcPr>
             <w:tcW w:w="0" w:type="auto"/>
@@ -4894,11 +5487,11 @@
               <w:pStyle w:val="ListParagraph"/>
               <w:numPr>
                 <w:ilvl w:val="0"/>
-                <w:numId w:val="9"/>
+                <w:numId w:val="10"/>
               </w:numPr>
-              <w:bidi/>
               <w:spacing w:before="280" w:after="0" w:line="240" w:lineRule="auto"/>
               <w:ind w:left="0" w:firstLine="0"/>
+              <w:jc w:val="right"/>
               <w:rPr>
                 <w:rFonts w:ascii="Segoe UI" w:hAnsi="Segoe UI" w:cs="Segoe UI"/>
                 <w:color w:val="212121"/>
@@ -4926,11 +5519,11 @@
               <w:pStyle w:val="ListParagraph"/>
               <w:numPr>
                 <w:ilvl w:val="0"/>
-                <w:numId w:val="9"/>
+                <w:numId w:val="10"/>
               </w:numPr>
-              <w:bidi/>
               <w:spacing w:before="280" w:after="0" w:line="240" w:lineRule="auto"/>
               <w:ind w:left="0" w:firstLine="0"/>
+              <w:jc w:val="right"/>
               <w:rPr>
                 <w:rFonts w:ascii="Segoe UI" w:hAnsi="Segoe UI" w:cs="Segoe UI"/>
                 <w:color w:val="212121"/>
@@ -4950,6 +5543,12 @@
         </w:tc>
       </w:tr>
       <w:tr>
+        <w:tblPrEx>
+          <w:tblCellMar>
+            <w:top w:w="0" w:type="dxa"/>
+            <w:bottom w:w="0" w:type="dxa"/>
+          </w:tblCellMar>
+        </w:tblPrEx>
         <w:tc>
           <w:tcPr>
             <w:tcW w:w="0" w:type="auto"/>
@@ -4960,11 +5559,11 @@
               <w:pStyle w:val="ListParagraph"/>
               <w:numPr>
                 <w:ilvl w:val="0"/>
-                <w:numId w:val="9"/>
+                <w:numId w:val="10"/>
               </w:numPr>
-              <w:bidi/>
               <w:spacing w:before="280" w:after="0" w:line="240" w:lineRule="auto"/>
               <w:ind w:left="0" w:firstLine="0"/>
+              <w:jc w:val="right"/>
               <w:rPr>
                 <w:rFonts w:ascii="Segoe UI" w:hAnsi="Segoe UI" w:cs="Segoe UI"/>
                 <w:color w:val="212121"/>
@@ -4992,11 +5591,11 @@
               <w:pStyle w:val="ListParagraph"/>
               <w:numPr>
                 <w:ilvl w:val="0"/>
-                <w:numId w:val="9"/>
+                <w:numId w:val="10"/>
               </w:numPr>
-              <w:bidi/>
               <w:spacing w:before="280" w:after="0" w:line="240" w:lineRule="auto"/>
               <w:ind w:left="0" w:firstLine="0"/>
+              <w:jc w:val="right"/>
               <w:rPr>
                 <w:rFonts w:ascii="Segoe UI" w:hAnsi="Segoe UI" w:cs="Segoe UI"/>
                 <w:color w:val="212121"/>
@@ -5016,6 +5615,12 @@
         </w:tc>
       </w:tr>
       <w:tr>
+        <w:tblPrEx>
+          <w:tblCellMar>
+            <w:top w:w="0" w:type="dxa"/>
+            <w:bottom w:w="0" w:type="dxa"/>
+          </w:tblCellMar>
+        </w:tblPrEx>
         <w:tc>
           <w:tcPr>
             <w:tcW w:w="0" w:type="auto"/>
@@ -5026,11 +5631,11 @@
               <w:pStyle w:val="ListParagraph"/>
               <w:numPr>
                 <w:ilvl w:val="0"/>
-                <w:numId w:val="9"/>
+                <w:numId w:val="10"/>
               </w:numPr>
-              <w:bidi/>
               <w:spacing w:before="280" w:after="0" w:line="240" w:lineRule="auto"/>
               <w:ind w:left="0" w:firstLine="0"/>
+              <w:jc w:val="right"/>
               <w:rPr>
                 <w:rFonts w:ascii="Segoe UI" w:hAnsi="Segoe UI" w:cs="Segoe UI"/>
                 <w:color w:val="212121"/>
@@ -5058,11 +5663,11 @@
               <w:pStyle w:val="ListParagraph"/>
               <w:numPr>
                 <w:ilvl w:val="0"/>
-                <w:numId w:val="9"/>
+                <w:numId w:val="10"/>
               </w:numPr>
-              <w:bidi/>
               <w:spacing w:before="280" w:after="0" w:line="240" w:lineRule="auto"/>
               <w:ind w:left="0" w:firstLine="0"/>
+              <w:jc w:val="right"/>
               <w:rPr>
                 <w:rFonts w:ascii="Segoe UI" w:hAnsi="Segoe UI" w:cs="Segoe UI"/>
                 <w:color w:val="212121"/>
@@ -5082,6 +5687,12 @@
         </w:tc>
       </w:tr>
       <w:tr>
+        <w:tblPrEx>
+          <w:tblCellMar>
+            <w:top w:w="0" w:type="dxa"/>
+            <w:bottom w:w="0" w:type="dxa"/>
+          </w:tblCellMar>
+        </w:tblPrEx>
         <w:tc>
           <w:tcPr>
             <w:tcW w:w="0" w:type="auto"/>
@@ -5092,11 +5703,11 @@
               <w:pStyle w:val="ListParagraph"/>
               <w:numPr>
                 <w:ilvl w:val="0"/>
-                <w:numId w:val="9"/>
+                <w:numId w:val="10"/>
               </w:numPr>
-              <w:bidi/>
               <w:spacing w:before="280" w:after="0" w:line="240" w:lineRule="auto"/>
               <w:ind w:left="0" w:firstLine="0"/>
+              <w:jc w:val="right"/>
               <w:rPr>
                 <w:rFonts w:ascii="Segoe UI" w:hAnsi="Segoe UI" w:cs="Segoe UI"/>
                 <w:color w:val="212121"/>
@@ -5124,11 +5735,11 @@
               <w:pStyle w:val="ListParagraph"/>
               <w:numPr>
                 <w:ilvl w:val="0"/>
-                <w:numId w:val="9"/>
+                <w:numId w:val="10"/>
               </w:numPr>
-              <w:bidi/>
               <w:spacing w:before="280" w:after="0" w:line="240" w:lineRule="auto"/>
               <w:ind w:left="0" w:firstLine="0"/>
+              <w:jc w:val="right"/>
               <w:rPr>
                 <w:rFonts w:ascii="Segoe UI" w:hAnsi="Segoe UI" w:cs="Segoe UI"/>
                 <w:color w:val="212121"/>
@@ -5148,6 +5759,12 @@
         </w:tc>
       </w:tr>
       <w:tr>
+        <w:tblPrEx>
+          <w:tblCellMar>
+            <w:top w:w="0" w:type="dxa"/>
+            <w:bottom w:w="0" w:type="dxa"/>
+          </w:tblCellMar>
+        </w:tblPrEx>
         <w:tc>
           <w:tcPr>
             <w:tcW w:w="0" w:type="auto"/>
@@ -5158,11 +5775,11 @@
               <w:pStyle w:val="ListParagraph"/>
               <w:numPr>
                 <w:ilvl w:val="0"/>
-                <w:numId w:val="9"/>
+                <w:numId w:val="10"/>
               </w:numPr>
-              <w:bidi/>
               <w:spacing w:before="280" w:after="0" w:line="240" w:lineRule="auto"/>
               <w:ind w:left="0" w:firstLine="0"/>
+              <w:jc w:val="right"/>
               <w:rPr>
                 <w:rFonts w:ascii="Segoe UI" w:hAnsi="Segoe UI" w:cs="Segoe UI"/>
                 <w:color w:val="212121"/>
@@ -5190,11 +5807,11 @@
               <w:pStyle w:val="ListParagraph"/>
               <w:numPr>
                 <w:ilvl w:val="0"/>
-                <w:numId w:val="9"/>
+                <w:numId w:val="10"/>
               </w:numPr>
-              <w:bidi/>
               <w:spacing w:before="280" w:after="0" w:line="240" w:lineRule="auto"/>
               <w:ind w:left="0" w:firstLine="0"/>
+              <w:jc w:val="right"/>
               <w:rPr>
                 <w:rFonts w:ascii="Segoe UI" w:hAnsi="Segoe UI" w:cs="Segoe UI"/>
                 <w:color w:val="212121"/>
@@ -5219,10 +5836,11 @@
         <w:pStyle w:val="ListParagraph"/>
         <w:numPr>
           <w:ilvl w:val="0"/>
-          <w:numId w:val="9"/>
+          <w:numId w:val="10"/>
         </w:numPr>
-        <w:bidi/>
         <w:spacing w:before="280" w:after="200" w:line="240" w:lineRule="auto"/>
+        <w:ind w:left="0"/>
+        <w:jc w:val="right"/>
         <w:rPr>
           <w:rFonts w:ascii="Segoe UI" w:hAnsi="Segoe UI" w:cs="Segoe UI"/>
           <w:color w:val="212121"/>
@@ -5234,10 +5852,11 @@
         <w:pStyle w:val="ListParagraph"/>
         <w:numPr>
           <w:ilvl w:val="0"/>
-          <w:numId w:val="9"/>
+          <w:numId w:val="10"/>
         </w:numPr>
-        <w:bidi/>
         <w:spacing w:before="280" w:after="200" w:line="240" w:lineRule="auto"/>
+        <w:ind w:left="0"/>
+        <w:jc w:val="right"/>
         <w:rPr>
           <w:rFonts w:ascii="Segoe UI" w:hAnsi="Segoe UI" w:cs="Segoe UI"/>
           <w:color w:val="212121"/>
@@ -5250,7 +5869,7 @@
           <w:color w:val="C2185B"/>
           <w:sz w:val="36"/>
         </w:rPr>
-        <w:t xml:space="preserve">21) </w:t>
+        <w:t xml:space="preserve">22) </w:t>
       </w:r>
       <w:r>
         <w:rPr>
@@ -5268,10 +5887,11 @@
         <w:pStyle w:val="ListParagraph"/>
         <w:numPr>
           <w:ilvl w:val="0"/>
-          <w:numId w:val="9"/>
+          <w:numId w:val="10"/>
         </w:numPr>
-        <w:bidi/>
         <w:spacing w:line="240" w:lineRule="auto"/>
+        <w:ind w:left="0"/>
+        <w:jc w:val="right"/>
         <w:rPr>
           <w:rFonts w:ascii="Segoe UI" w:hAnsi="Segoe UI" w:cs="Segoe UI"/>
           <w:color w:val="212121"/>
@@ -5295,8 +5915,8 @@
     </w:p>
     <w:p>
       <w:pPr>
-        <w:bidi/>
         <w:spacing w:line="240" w:lineRule="auto"/>
+        <w:jc w:val="right"/>
         <w:rPr>
           <w:rFonts w:ascii="Segoe UI" w:hAnsi="Segoe UI" w:cs="Segoe UI"/>
           <w:color w:val="212121"/>
@@ -5309,14 +5929,72 @@
       <w:cols w:space="720"/>
       <w:docGrid w:linePitch="360"/>
     </w:sectPr>
+    <w:p>
+      <w:pPr>
+        <w:jc w:val="right"/>
+        <w:bidi/>
+      </w:pPr>
+      <w:r>
+        <w:rPr>
+          <w:bidi/>
+          <w:rtl/>
+        </w:rPr>
+        <w:t xml:space="preserve">تحديثات سبتمبر 2026: نشر Railway، POS بثلاثة أقسام، عضويات بربط خدمات، حفظ إعدادات لكل قسم، بحث حالة الحجز بالرمز/الجوال/الاسم.</w:t>
+      </w:r>
+    </w:p>
   </w:body>
 </w:document>
 </file>
 
-<file path=word/numbering.xml><?xml version="1.0" encoding="utf-8"?>
+<file path=word\fontTable.xml><?xml version="1.0" encoding="utf-8"?>
+<w:fonts xmlns:mc="http://schemas.openxmlformats.org/markup-compatibility/2006" xmlns:r="http://schemas.openxmlformats.org/officeDocument/2006/relationships" xmlns:w="http://schemas.openxmlformats.org/wordprocessingml/2006/main" xmlns:w14="http://schemas.microsoft.com/office/word/2010/wordml" xmlns:w15="http://schemas.microsoft.com/office/word/2012/wordml" xmlns:w16cex="http://schemas.microsoft.com/office/word/2018/wordml/cex" xmlns:w16cid="http://schemas.microsoft.com/office/word/2016/wordml/cid" xmlns:w16="http://schemas.microsoft.com/office/word/2018/wordml" xmlns:w16sdtdh="http://schemas.microsoft.com/office/word/2020/wordml/sdtdatahash" xmlns:w16se="http://schemas.microsoft.com/office/word/2015/wordml/symex" mc:Ignorable="w14 w15 w16se w16cid w16 w16cex w16sdtdh">
+  <w:font w:name="Symbol">
+    <w:panose1 w:val="05050102010706020507"/>
+    <w:charset w:val="02"/>
+    <w:family w:val="roman"/>
+    <w:pitch w:val="variable"/>
+    <w:sig w:usb0="00000000" w:usb1="10000000" w:usb2="00000000" w:usb3="00000000" w:csb0="80000000" w:csb1="00000000"/>
+  </w:font>
+  <w:font w:name="Times New Roman">
+    <w:panose1 w:val="02020603050405020304"/>
+    <w:charset w:val="00"/>
+    <w:family w:val="roman"/>
+    <w:pitch w:val="variable"/>
+    <w:sig w:usb0="E0002EFF" w:usb1="C000785B" w:usb2="00000009" w:usb3="00000000" w:csb0="000001FF" w:csb1="00000000"/>
+  </w:font>
+  <w:font w:name="Aptos">
+    <w:charset w:val="00"/>
+    <w:family w:val="swiss"/>
+    <w:pitch w:val="variable"/>
+    <w:sig w:usb0="20000287" w:usb1="00000003" w:usb2="00000000" w:usb3="00000000" w:csb0="0000019F" w:csb1="00000000"/>
+  </w:font>
+  <w:font w:name="Arial">
+    <w:panose1 w:val="020B0604020202020204"/>
+    <w:charset w:val="00"/>
+    <w:family w:val="swiss"/>
+    <w:pitch w:val="variable"/>
+    <w:sig w:usb0="E0002EFF" w:usb1="C000785B" w:usb2="00000009" w:usb3="00000000" w:csb0="000001FF" w:csb1="00000000"/>
+  </w:font>
+  <w:font w:name="Aptos Display">
+    <w:charset w:val="00"/>
+    <w:family w:val="swiss"/>
+    <w:pitch w:val="variable"/>
+    <w:sig w:usb0="20000287" w:usb1="00000003" w:usb2="00000000" w:usb3="00000000" w:csb0="0000019F" w:csb1="00000000"/>
+  </w:font>
+  <w:font w:name="Segoe UI">
+    <w:panose1 w:val="020B0502040204020203"/>
+    <w:charset w:val="00"/>
+    <w:family w:val="swiss"/>
+    <w:pitch w:val="variable"/>
+    <w:sig w:usb0="E4002EFF" w:usb1="C000E47F" w:usb2="00000009" w:usb3="00000000" w:csb0="000001FF" w:csb1="00000000"/>
+  </w:font>
+</w:fonts>
+</file>
+
+<file path=word\numbering.xml><?xml version="1.0" encoding="utf-8"?>
 <w:numbering xmlns:wpc="http://schemas.microsoft.com/office/word/2010/wordprocessingCanvas" xmlns:cx="http://schemas.microsoft.com/office/drawing/2014/chartex" xmlns:cx1="http://schemas.microsoft.com/office/drawing/2015/9/8/chartex" xmlns:cx2="http://schemas.microsoft.com/office/drawing/2015/10/21/chartex" xmlns:cx3="http://schemas.microsoft.com/office/drawing/2016/5/9/chartex" xmlns:cx4="http://schemas.microsoft.com/office/drawing/2016/5/10/chartex" xmlns:cx5="http://schemas.microsoft.com/office/drawing/2016/5/11/chartex" xmlns:cx6="http://schemas.microsoft.com/office/drawing/2016/5/12/chartex" xmlns:cx7="http://schemas.microsoft.com/office/drawing/2016/5/13/chartex" xmlns:cx8="http://schemas.microsoft.com/office/drawing/2016/5/14/chartex" xmlns:mc="http://schemas.openxmlformats.org/markup-compatibility/2006" xmlns:aink="http://schemas.microsoft.com/office/drawing/2016/ink" xmlns:am3d="http://schemas.microsoft.com/office/drawing/2017/model3d" xmlns:o="urn:schemas-microsoft-com:office:office" xmlns:oel="http://schemas.microsoft.com/office/2019/extlst" xmlns:r="http://schemas.openxmlformats.org/officeDocument/2006/relationships" xmlns:m="http://schemas.openxmlformats.org/officeDocument/2006/math" xmlns:v="urn:schemas-microsoft-com:vml" xmlns:wp14="http://schemas.microsoft.com/office/word/2010/wordprocessingDrawing" xmlns:wp="http://schemas.openxmlformats.org/drawingml/2006/wordprocessingDrawing" xmlns:w10="urn:schemas-microsoft-com:office:word" xmlns:w="http://schemas.openxmlformats.org/wordprocessingml/2006/main" xmlns:w14="http://schemas.microsoft.com/office/word/2010/wordml" xmlns:w15="http://schemas.microsoft.com/office/word/2012/wordml" xmlns:w16cex="http://schemas.microsoft.com/office/word/2018/wordml/cex" xmlns:w16cid="http://schemas.microsoft.com/office/word/2016/wordml/cid" xmlns:w16="http://schemas.microsoft.com/office/word/2018/wordml" xmlns:w16sdtdh="http://schemas.microsoft.com/office/word/2020/wordml/sdtdatahash" xmlns:w16se="http://schemas.microsoft.com/office/word/2015/wordml/symex" xmlns:wpg="http://schemas.microsoft.com/office/word/2010/wordprocessingGroup" xmlns:wpi="http://schemas.microsoft.com/office/word/2010/wordprocessingInk" xmlns:wne="http://schemas.microsoft.com/office/word/2006/wordml" xmlns:wps="http://schemas.microsoft.com/office/word/2010/wordprocessingShape" mc:Ignorable="w14 w15 w16se w16cid w16 w16cex w16sdtdh wp14">
   <w:abstractNum w:abstractNumId="0" w15:restartNumberingAfterBreak="0">
-    <w:nsid w:val="1A462EFA"/>
+    <w:nsid w:val="03F03179"/>
     <w:multiLevelType w:val="singleLevel"/>
     <w:tmpl w:val="04090001"/>
     <w:lvl w:ilvl="0">
@@ -5333,7 +6011,7 @@
     </w:lvl>
   </w:abstractNum>
   <w:abstractNum w:abstractNumId="1" w15:restartNumberingAfterBreak="0">
-    <w:nsid w:val="1ACC3DBA"/>
+    <w:nsid w:val="0D384AC1"/>
     <w:multiLevelType w:val="singleLevel"/>
     <w:tmpl w:val="04090001"/>
     <w:lvl w:ilvl="0">
@@ -5350,7 +6028,7 @@
     </w:lvl>
   </w:abstractNum>
   <w:abstractNum w:abstractNumId="2" w15:restartNumberingAfterBreak="0">
-    <w:nsid w:val="26AF2FB8"/>
+    <w:nsid w:val="29DB7AC3"/>
     <w:multiLevelType w:val="singleLevel"/>
     <w:tmpl w:val="04090001"/>
     <w:lvl w:ilvl="0">
@@ -5367,7 +6045,7 @@
     </w:lvl>
   </w:abstractNum>
   <w:abstractNum w:abstractNumId="3" w15:restartNumberingAfterBreak="0">
-    <w:nsid w:val="28C96A57"/>
+    <w:nsid w:val="59FA0C49"/>
     <w:multiLevelType w:val="singleLevel"/>
     <w:tmpl w:val="04090001"/>
     <w:lvl w:ilvl="0">
@@ -5384,7 +6062,7 @@
     </w:lvl>
   </w:abstractNum>
   <w:abstractNum w:abstractNumId="4" w15:restartNumberingAfterBreak="0">
-    <w:nsid w:val="4BB75E71"/>
+    <w:nsid w:val="5DE15964"/>
     <w:multiLevelType w:val="singleLevel"/>
     <w:tmpl w:val="04090001"/>
     <w:lvl w:ilvl="0">
@@ -5401,7 +6079,7 @@
     </w:lvl>
   </w:abstractNum>
   <w:abstractNum w:abstractNumId="5" w15:restartNumberingAfterBreak="0">
-    <w:nsid w:val="5D776B56"/>
+    <w:nsid w:val="73083DEC"/>
     <w:multiLevelType w:val="singleLevel"/>
     <w:tmpl w:val="04090001"/>
     <w:lvl w:ilvl="0">
@@ -5418,7 +6096,7 @@
     </w:lvl>
   </w:abstractNum>
   <w:abstractNum w:abstractNumId="6" w15:restartNumberingAfterBreak="0">
-    <w:nsid w:val="6A407A75"/>
+    <w:nsid w:val="7507713A"/>
     <w:multiLevelType w:val="singleLevel"/>
     <w:tmpl w:val="04090001"/>
     <w:lvl w:ilvl="0">
@@ -5435,7 +6113,7 @@
     </w:lvl>
   </w:abstractNum>
   <w:abstractNum w:abstractNumId="7" w15:restartNumberingAfterBreak="0">
-    <w:nsid w:val="775416EA"/>
+    <w:nsid w:val="772F2920"/>
     <w:multiLevelType w:val="singleLevel"/>
     <w:tmpl w:val="04090001"/>
     <w:lvl w:ilvl="0">
@@ -5452,7 +6130,7 @@
     </w:lvl>
   </w:abstractNum>
   <w:abstractNum w:abstractNumId="8" w15:restartNumberingAfterBreak="0">
-    <w:nsid w:val="79383DA2"/>
+    <w:nsid w:val="7D4A5486"/>
     <w:multiLevelType w:val="singleLevel"/>
     <w:tmpl w:val="04090001"/>
     <w:lvl w:ilvl="0">
@@ -5468,37 +6146,107 @@
       </w:rPr>
     </w:lvl>
   </w:abstractNum>
-  <w:num w:numId="1" w16cid:durableId="1803109676">
+  <w:abstractNum w:abstractNumId="9" w15:restartNumberingAfterBreak="0">
+    <w:nsid w:val="7EB415E7"/>
+    <w:multiLevelType w:val="singleLevel"/>
+    <w:tmpl w:val="04090001"/>
+    <w:lvl w:ilvl="0">
+      <w:start w:val="1"/>
+      <w:numFmt w:val="bullet"/>
+      <w:lvlText w:val=""/>
+      <w:lvlJc w:val="left"/>
+      <w:pPr>
+        <w:ind w:left="720" w:hanging="360"/>
+      </w:pPr>
+      <w:rPr>
+        <w:rFonts w:ascii="Symbol" w:hAnsi="Symbol" w:hint="default"/>
+      </w:rPr>
+    </w:lvl>
+  </w:abstractNum>
+  <w:num w:numId="1" w16cid:durableId="1338312566">
+    <w:abstractNumId w:val="3"/>
+  </w:num>
+  <w:num w:numId="2" w16cid:durableId="2086563257">
+    <w:abstractNumId w:val="2"/>
+  </w:num>
+  <w:num w:numId="3" w16cid:durableId="1628076285">
+    <w:abstractNumId w:val="4"/>
+  </w:num>
+  <w:num w:numId="4" w16cid:durableId="58023418">
+    <w:abstractNumId w:val="9"/>
+  </w:num>
+  <w:num w:numId="5" w16cid:durableId="1889948580">
+    <w:abstractNumId w:val="0"/>
+  </w:num>
+  <w:num w:numId="6" w16cid:durableId="1549026054">
+    <w:abstractNumId w:val="8"/>
+  </w:num>
+  <w:num w:numId="7" w16cid:durableId="1140222855">
+    <w:abstractNumId w:val="7"/>
+  </w:num>
+  <w:num w:numId="8" w16cid:durableId="819731673">
+    <w:abstractNumId w:val="6"/>
+  </w:num>
+  <w:num w:numId="9" w16cid:durableId="137118356">
     <w:abstractNumId w:val="5"/>
   </w:num>
-  <w:num w:numId="2" w16cid:durableId="1477793718">
-    <w:abstractNumId w:val="0"/>
-  </w:num>
-  <w:num w:numId="3" w16cid:durableId="455829774">
-    <w:abstractNumId w:val="8"/>
-  </w:num>
-  <w:num w:numId="4" w16cid:durableId="1355693900">
-    <w:abstractNumId w:val="7"/>
-  </w:num>
-  <w:num w:numId="5" w16cid:durableId="754663962">
-    <w:abstractNumId w:val="2"/>
-  </w:num>
-  <w:num w:numId="6" w16cid:durableId="888223619">
-    <w:abstractNumId w:val="6"/>
-  </w:num>
-  <w:num w:numId="7" w16cid:durableId="1118450684">
+  <w:num w:numId="10" w16cid:durableId="2077123740">
     <w:abstractNumId w:val="1"/>
-  </w:num>
-  <w:num w:numId="8" w16cid:durableId="1100376605">
-    <w:abstractNumId w:val="3"/>
-  </w:num>
-  <w:num w:numId="9" w16cid:durableId="1249118586">
-    <w:abstractNumId w:val="4"/>
   </w:num>
 </w:numbering>
 </file>
 
-<file path=word/styles.xml><?xml version="1.0" encoding="utf-8"?>
+<file path=word\settings.xml><?xml version="1.0" encoding="utf-8"?>
+<w:settings xmlns:mc="http://schemas.openxmlformats.org/markup-compatibility/2006" xmlns:o="urn:schemas-microsoft-com:office:office" xmlns:r="http://schemas.openxmlformats.org/officeDocument/2006/relationships" xmlns:m="http://schemas.openxmlformats.org/officeDocument/2006/math" xmlns:v="urn:schemas-microsoft-com:vml" xmlns:w10="urn:schemas-microsoft-com:office:word" xmlns:w="http://schemas.openxmlformats.org/wordprocessingml/2006/main" xmlns:w14="http://schemas.microsoft.com/office/word/2010/wordml" xmlns:w15="http://schemas.microsoft.com/office/word/2012/wordml" xmlns:w16cex="http://schemas.microsoft.com/office/word/2018/wordml/cex" xmlns:w16cid="http://schemas.microsoft.com/office/word/2016/wordml/cid" xmlns:w16="http://schemas.microsoft.com/office/word/2018/wordml" xmlns:w16sdtdh="http://schemas.microsoft.com/office/word/2020/wordml/sdtdatahash" xmlns:w16se="http://schemas.microsoft.com/office/word/2015/wordml/symex" xmlns:sl="http://schemas.openxmlformats.org/schemaLibrary/2006/main" mc:Ignorable="w14 w15 w16se w16cid w16 w16cex w16sdtdh">
+  <w:zoom w:percent="100"/>
+  <w:defaultTabStop w:val="720"/>
+  <w:characterSpacingControl w:val="doNotCompress"/>
+  <w:compat>
+    <w:compatSetting w:name="compatibilityMode" w:uri="http://schemas.microsoft.com/office/word" w:val="15"/>
+    <w:compatSetting w:name="overrideTableStyleFontSizeAndJustification" w:uri="http://schemas.microsoft.com/office/word" w:val="1"/>
+    <w:compatSetting w:name="enableOpenTypeFeatures" w:uri="http://schemas.microsoft.com/office/word" w:val="1"/>
+    <w:compatSetting w:name="doNotFlipMirrorIndents" w:uri="http://schemas.microsoft.com/office/word" w:val="1"/>
+    <w:compatSetting w:name="differentiateMultirowTableHeaders" w:uri="http://schemas.microsoft.com/office/word" w:val="1"/>
+    <w:compatSetting w:name="useWord2013TrackBottomHyphenation" w:uri="http://schemas.microsoft.com/office/word" w:val="0"/>
+  </w:compat>
+  <w:rsids>
+    <w:rsidRoot w:val="00045930"/>
+    <w:rsid w:val="00045930"/>
+    <w:rsid w:val="005B29A0"/>
+    <w:rsid w:val="00796CD0"/>
+    <w:rsid w:val="008A2232"/>
+    <w:rsid w:val="00977FA5"/>
+  </w:rsids>
+  <m:mathPr>
+    <m:mathFont m:val="Cambria Math"/>
+    <m:brkBin m:val="before"/>
+    <m:brkBinSub m:val="--"/>
+    <m:smallFrac m:val="0"/>
+    <m:dispDef/>
+    <m:lMargin m:val="0"/>
+    <m:rMargin m:val="0"/>
+    <m:defJc m:val="centerGroup"/>
+    <m:wrapIndent m:val="1440"/>
+    <m:intLim m:val="subSup"/>
+    <m:naryLim m:val="undOvr"/>
+  </m:mathPr>
+  <w:themeFontLang w:val="en-US" w:bidi="ar-SA"/>
+  <w:clrSchemeMapping w:bg1="light1" w:t1="dark1" w:bg2="light2" w:t2="dark2" w:accent1="accent1" w:accent2="accent2" w:accent3="accent3" w:accent4="accent4" w:accent5="accent5" w:accent6="accent6" w:hyperlink="hyperlink" w:followedHyperlink="followedHyperlink"/>
+  <w:shapeDefaults>
+    <o:shapedefaults v:ext="edit" spidmax="1026"/>
+    <o:shapelayout v:ext="edit">
+      <o:idmap v:ext="edit" data="1"/>
+    </o:shapelayout>
+  </w:shapeDefaults>
+  <w:decimalSymbol w:val="."/>
+  <w:listSeparator w:val=","/>
+  <w14:docId w14:val="575A936A"/>
+  <w15:chartTrackingRefBased/>
+  <w15:docId w15:val="{50B04A36-91E2-4175-ADD5-C1030652CA54}"/>
+</w:settings>
+</file>
+
+<file path=word\styles.xml><?xml version="1.0" encoding="utf-8"?>
 <w:styles xmlns:mc="http://schemas.openxmlformats.org/markup-compatibility/2006" xmlns:r="http://schemas.openxmlformats.org/officeDocument/2006/relationships" xmlns:w="http://schemas.openxmlformats.org/wordprocessingml/2006/main" xmlns:w14="http://schemas.microsoft.com/office/word/2010/wordml" xmlns:w15="http://schemas.microsoft.com/office/word/2012/wordml" xmlns:w16cex="http://schemas.microsoft.com/office/word/2018/wordml/cex" xmlns:w16cid="http://schemas.microsoft.com/office/word/2016/wordml/cid" xmlns:w16="http://schemas.microsoft.com/office/word/2018/wordml" xmlns:w16sdtdh="http://schemas.microsoft.com/office/word/2020/wordml/sdtdatahash" xmlns:w16se="http://schemas.microsoft.com/office/word/2015/wordml/symex" mc:Ignorable="w14 w15 w16se w16cid w16 w16cex w16sdtdh">
   <w:docDefaults>
     <w:rPrDefault>
@@ -5906,7 +6654,7 @@
     <w:link w:val="Heading1Char"/>
     <w:uiPriority w:val="9"/>
     <w:qFormat/>
-    <w:rsid w:val="00A83683"/>
+    <w:rsid w:val="00045930"/>
     <w:pPr>
       <w:keepNext/>
       <w:keepLines/>
@@ -5929,7 +6677,7 @@
     <w:semiHidden/>
     <w:unhideWhenUsed/>
     <w:qFormat/>
-    <w:rsid w:val="00A83683"/>
+    <w:rsid w:val="00045930"/>
     <w:pPr>
       <w:keepNext/>
       <w:keepLines/>
@@ -5952,7 +6700,7 @@
     <w:semiHidden/>
     <w:unhideWhenUsed/>
     <w:qFormat/>
-    <w:rsid w:val="00A83683"/>
+    <w:rsid w:val="00045930"/>
     <w:pPr>
       <w:keepNext/>
       <w:keepLines/>
@@ -5975,7 +6723,7 @@
     <w:semiHidden/>
     <w:unhideWhenUsed/>
     <w:qFormat/>
-    <w:rsid w:val="00A83683"/>
+    <w:rsid w:val="00045930"/>
     <w:pPr>
       <w:keepNext/>
       <w:keepLines/>
@@ -5998,7 +6746,7 @@
     <w:semiHidden/>
     <w:unhideWhenUsed/>
     <w:qFormat/>
-    <w:rsid w:val="00A83683"/>
+    <w:rsid w:val="00045930"/>
     <w:pPr>
       <w:keepNext/>
       <w:keepLines/>
@@ -6019,7 +6767,7 @@
     <w:semiHidden/>
     <w:unhideWhenUsed/>
     <w:qFormat/>
-    <w:rsid w:val="00A83683"/>
+    <w:rsid w:val="00045930"/>
     <w:pPr>
       <w:keepNext/>
       <w:keepLines/>
@@ -6042,7 +6790,7 @@
     <w:semiHidden/>
     <w:unhideWhenUsed/>
     <w:qFormat/>
-    <w:rsid w:val="00A83683"/>
+    <w:rsid w:val="00045930"/>
     <w:pPr>
       <w:keepNext/>
       <w:keepLines/>
@@ -6063,7 +6811,7 @@
     <w:semiHidden/>
     <w:unhideWhenUsed/>
     <w:qFormat/>
-    <w:rsid w:val="00A83683"/>
+    <w:rsid w:val="00045930"/>
     <w:pPr>
       <w:keepNext/>
       <w:keepLines/>
@@ -6086,7 +6834,7 @@
     <w:semiHidden/>
     <w:unhideWhenUsed/>
     <w:qFormat/>
-    <w:rsid w:val="00A83683"/>
+    <w:rsid w:val="00045930"/>
     <w:pPr>
       <w:keepNext/>
       <w:keepLines/>
@@ -6130,7 +6878,7 @@
     <w:basedOn w:val="DefaultParagraphFont"/>
     <w:link w:val="Heading1"/>
     <w:uiPriority w:val="9"/>
-    <w:rsid w:val="00A83683"/>
+    <w:rsid w:val="00045930"/>
     <w:rPr>
       <w:rFonts w:asciiTheme="majorHAnsi" w:eastAsiaTheme="majorEastAsia" w:hAnsiTheme="majorHAnsi" w:cstheme="majorBidi"/>
       <w:color w:val="0F4761" w:themeColor="accent1" w:themeShade="BF"/>
@@ -6144,7 +6892,7 @@
     <w:link w:val="Heading2"/>
     <w:uiPriority w:val="9"/>
     <w:semiHidden/>
-    <w:rsid w:val="00A83683"/>
+    <w:rsid w:val="00045930"/>
     <w:rPr>
       <w:rFonts w:asciiTheme="majorHAnsi" w:eastAsiaTheme="majorEastAsia" w:hAnsiTheme="majorHAnsi" w:cstheme="majorBidi"/>
       <w:color w:val="0F4761" w:themeColor="accent1" w:themeShade="BF"/>
@@ -6158,7 +6906,7 @@
     <w:link w:val="Heading3"/>
     <w:uiPriority w:val="9"/>
     <w:semiHidden/>
-    <w:rsid w:val="00A83683"/>
+    <w:rsid w:val="00045930"/>
     <w:rPr>
       <w:rFonts w:eastAsiaTheme="majorEastAsia" w:cstheme="majorBidi"/>
       <w:color w:val="0F4761" w:themeColor="accent1" w:themeShade="BF"/>
@@ -6172,7 +6920,7 @@
     <w:link w:val="Heading4"/>
     <w:uiPriority w:val="9"/>
     <w:semiHidden/>
-    <w:rsid w:val="00A83683"/>
+    <w:rsid w:val="00045930"/>
     <w:rPr>
       <w:rFonts w:eastAsiaTheme="majorEastAsia" w:cstheme="majorBidi"/>
       <w:i/>
@@ -6186,7 +6934,7 @@
     <w:link w:val="Heading5"/>
     <w:uiPriority w:val="9"/>
     <w:semiHidden/>
-    <w:rsid w:val="00A83683"/>
+    <w:rsid w:val="00045930"/>
     <w:rPr>
       <w:rFonts w:eastAsiaTheme="majorEastAsia" w:cstheme="majorBidi"/>
       <w:color w:val="0F4761" w:themeColor="accent1" w:themeShade="BF"/>
@@ -6198,7 +6946,7 @@
     <w:link w:val="Heading6"/>
     <w:uiPriority w:val="9"/>
     <w:semiHidden/>
-    <w:rsid w:val="00A83683"/>
+    <w:rsid w:val="00045930"/>
     <w:rPr>
       <w:rFonts w:eastAsiaTheme="majorEastAsia" w:cstheme="majorBidi"/>
       <w:i/>
@@ -6212,7 +6960,7 @@
     <w:link w:val="Heading7"/>
     <w:uiPriority w:val="9"/>
     <w:semiHidden/>
-    <w:rsid w:val="00A83683"/>
+    <w:rsid w:val="00045930"/>
     <w:rPr>
       <w:rFonts w:eastAsiaTheme="majorEastAsia" w:cstheme="majorBidi"/>
       <w:color w:val="595959" w:themeColor="text1" w:themeTint="A6"/>
@@ -6224,7 +6972,7 @@
     <w:link w:val="Heading8"/>
     <w:uiPriority w:val="9"/>
     <w:semiHidden/>
-    <w:rsid w:val="00A83683"/>
+    <w:rsid w:val="00045930"/>
     <w:rPr>
       <w:rFonts w:eastAsiaTheme="majorEastAsia" w:cstheme="majorBidi"/>
       <w:i/>
@@ -6238,7 +6986,7 @@
     <w:link w:val="Heading9"/>
     <w:uiPriority w:val="9"/>
     <w:semiHidden/>
-    <w:rsid w:val="00A83683"/>
+    <w:rsid w:val="00045930"/>
     <w:rPr>
       <w:rFonts w:eastAsiaTheme="majorEastAsia" w:cstheme="majorBidi"/>
       <w:color w:val="272727" w:themeColor="text1" w:themeTint="D8"/>
@@ -6251,7 +6999,7 @@
     <w:link w:val="TitleChar"/>
     <w:uiPriority w:val="10"/>
     <w:qFormat/>
-    <w:rsid w:val="00A83683"/>
+    <w:rsid w:val="00045930"/>
     <w:pPr>
       <w:spacing w:after="80" w:line="240" w:lineRule="auto"/>
       <w:contextualSpacing/>
@@ -6269,7 +7017,7 @@
     <w:basedOn w:val="DefaultParagraphFont"/>
     <w:link w:val="Title"/>
     <w:uiPriority w:val="10"/>
-    <w:rsid w:val="00A83683"/>
+    <w:rsid w:val="00045930"/>
     <w:rPr>
       <w:rFonts w:asciiTheme="majorHAnsi" w:eastAsiaTheme="majorEastAsia" w:hAnsiTheme="majorHAnsi" w:cstheme="majorBidi"/>
       <w:spacing w:val="-10"/>
@@ -6285,7 +7033,7 @@
     <w:link w:val="SubtitleChar"/>
     <w:uiPriority w:val="11"/>
     <w:qFormat/>
-    <w:rsid w:val="00A83683"/>
+    <w:rsid w:val="00045930"/>
     <w:pPr>
       <w:numPr>
         <w:ilvl w:val="1"/>
@@ -6304,7 +7052,7 @@
     <w:basedOn w:val="DefaultParagraphFont"/>
     <w:link w:val="Subtitle"/>
     <w:uiPriority w:val="11"/>
-    <w:rsid w:val="00A83683"/>
+    <w:rsid w:val="00045930"/>
     <w:rPr>
       <w:rFonts w:eastAsiaTheme="majorEastAsia" w:cstheme="majorBidi"/>
       <w:color w:val="595959" w:themeColor="text1" w:themeTint="A6"/>
@@ -6320,7 +7068,7 @@
     <w:link w:val="QuoteChar"/>
     <w:uiPriority w:val="29"/>
     <w:qFormat/>
-    <w:rsid w:val="00A83683"/>
+    <w:rsid w:val="00045930"/>
     <w:pPr>
       <w:spacing w:before="160"/>
       <w:jc w:val="center"/>
@@ -6336,7 +7084,7 @@
     <w:basedOn w:val="DefaultParagraphFont"/>
     <w:link w:val="Quote"/>
     <w:uiPriority w:val="29"/>
-    <w:rsid w:val="00A83683"/>
+    <w:rsid w:val="00045930"/>
     <w:rPr>
       <w:i/>
       <w:iCs/>
@@ -6348,7 +7096,7 @@
     <w:basedOn w:val="Normal"/>
     <w:uiPriority w:val="34"/>
     <w:qFormat/>
-    <w:rsid w:val="00A83683"/>
+    <w:rsid w:val="00045930"/>
     <w:pPr>
       <w:ind w:left="720"/>
       <w:contextualSpacing/>
@@ -6359,7 +7107,7 @@
     <w:basedOn w:val="DefaultParagraphFont"/>
     <w:uiPriority w:val="21"/>
     <w:qFormat/>
-    <w:rsid w:val="00A83683"/>
+    <w:rsid w:val="00045930"/>
     <w:rPr>
       <w:i/>
       <w:iCs/>
@@ -6373,7 +7121,7 @@
     <w:link w:val="IntenseQuoteChar"/>
     <w:uiPriority w:val="30"/>
     <w:qFormat/>
-    <w:rsid w:val="00A83683"/>
+    <w:rsid w:val="00045930"/>
     <w:pPr>
       <w:pBdr>
         <w:top w:val="single" w:sz="4" w:space="10" w:color="0F4761" w:themeColor="accent1" w:themeShade="BF"/>
@@ -6394,7 +7142,7 @@
     <w:basedOn w:val="DefaultParagraphFont"/>
     <w:link w:val="IntenseQuote"/>
     <w:uiPriority w:val="30"/>
-    <w:rsid w:val="00A83683"/>
+    <w:rsid w:val="00045930"/>
     <w:rPr>
       <w:i/>
       <w:iCs/>
@@ -6406,7 +7154,7 @@
     <w:basedOn w:val="DefaultParagraphFont"/>
     <w:uiPriority w:val="32"/>
     <w:qFormat/>
-    <w:rsid w:val="00A83683"/>
+    <w:rsid w:val="00045930"/>
     <w:rPr>
       <w:b/>
       <w:bCs/>
@@ -6418,7 +7166,7 @@
 </w:styles>
 </file>
 
-<file path=word/theme/theme1.xml><?xml version="1.0" encoding="utf-8"?>
+<file path=word\theme\theme1.xml><?xml version="1.0" encoding="utf-8"?>
 <a:theme xmlns:a="http://schemas.openxmlformats.org/drawingml/2006/main" name="Office Theme">
   <a:themeElements>
     <a:clrScheme name="Office">
@@ -6711,4 +7459,11 @@
     </a:ext>
   </a:extLst>
 </a:theme>
+</file>
+
+<file path=word\webSettings.xml><?xml version="1.0" encoding="utf-8"?>
+<w:webSettings xmlns:mc="http://schemas.openxmlformats.org/markup-compatibility/2006" xmlns:r="http://schemas.openxmlformats.org/officeDocument/2006/relationships" xmlns:w="http://schemas.openxmlformats.org/wordprocessingml/2006/main" xmlns:w14="http://schemas.microsoft.com/office/word/2010/wordml" xmlns:w15="http://schemas.microsoft.com/office/word/2012/wordml" xmlns:w16cex="http://schemas.microsoft.com/office/word/2018/wordml/cex" xmlns:w16cid="http://schemas.microsoft.com/office/word/2016/wordml/cid" xmlns:w16="http://schemas.microsoft.com/office/word/2018/wordml" xmlns:w16sdtdh="http://schemas.microsoft.com/office/word/2020/wordml/sdtdatahash" xmlns:w16se="http://schemas.microsoft.com/office/word/2015/wordml/symex" mc:Ignorable="w14 w15 w16se w16cid w16 w16cex w16sdtdh">
+  <w:optimizeForBrowser/>
+  <w:allowPNG/>
+</w:webSettings>
 </file>
</xml_diff>